<commit_message>
Update documentation in Laporan Implementasi Algoritma A Star Search to clarify program structure, usage instructions, and testing scenarios
</commit_message>
<xml_diff>
--- a/Laporan Implementasi Algoritma A Star Search.docx
+++ b/Laporan Implementasi Algoritma A Star Search.docx
@@ -13817,31 +13817,1462 @@
         <w:jc w:val="both"/>
       </w:pPr>
       <w:r>
-        <w:t>Paket program berisi fungsi pencarian, pengujian lima skenario, dan rangkaian eksperimen tambahan. Ekstrak seluruh paket sebelum menjalankan supaya modul Python tetap berada bersama. Skrip pengujian mengambil fungsi utama melalui impor modul. Jika berkas uji dipindah tanpa modul pendukungnya, pemanggilan dapat gagal walaupun logika algoritma tidak berubah.</w:t>
+        <w:t xml:space="preserve">Program </w:t>
+      </w:r>
+      <w:proofErr w:type="spellStart"/>
+      <w:r>
+        <w:t>terdiri</w:t>
+      </w:r>
+      <w:proofErr w:type="spellEnd"/>
+      <w:r>
+        <w:t xml:space="preserve"> </w:t>
+      </w:r>
+      <w:proofErr w:type="spellStart"/>
+      <w:r>
+        <w:t>atas</w:t>
+      </w:r>
+      <w:proofErr w:type="spellEnd"/>
+      <w:r>
+        <w:t xml:space="preserve"> </w:t>
+      </w:r>
+      <w:proofErr w:type="spellStart"/>
+      <w:r>
+        <w:t>empat</w:t>
+      </w:r>
+      <w:proofErr w:type="spellEnd"/>
+      <w:r>
+        <w:t xml:space="preserve"> </w:t>
+      </w:r>
+      <w:proofErr w:type="spellStart"/>
+      <w:r>
+        <w:t>berkas</w:t>
+      </w:r>
+      <w:proofErr w:type="spellEnd"/>
+      <w:r>
+        <w:t xml:space="preserve"> Python </w:t>
+      </w:r>
+      <w:proofErr w:type="spellStart"/>
+      <w:r>
+        <w:t>utama</w:t>
+      </w:r>
+      <w:proofErr w:type="spellEnd"/>
+      <w:r>
+        <w:t xml:space="preserve">, </w:t>
+      </w:r>
+      <w:proofErr w:type="spellStart"/>
+      <w:r>
+        <w:t>yaitu</w:t>
+      </w:r>
+      <w:proofErr w:type="spellEnd"/>
+      <w:r>
+        <w:t xml:space="preserve"> algoritma.py, data_kasus.py, server.py, dan uji_backend.py, </w:t>
+      </w:r>
+      <w:proofErr w:type="spellStart"/>
+      <w:r>
+        <w:t>serta</w:t>
+      </w:r>
+      <w:proofErr w:type="spellEnd"/>
+      <w:r>
+        <w:t xml:space="preserve"> folder static </w:t>
+      </w:r>
+      <w:proofErr w:type="spellStart"/>
+      <w:r>
+        <w:t>untuk</w:t>
+      </w:r>
+      <w:proofErr w:type="spellEnd"/>
+      <w:r>
+        <w:t xml:space="preserve"> </w:t>
+      </w:r>
+      <w:proofErr w:type="spellStart"/>
+      <w:r>
+        <w:t>tampilan</w:t>
+      </w:r>
+      <w:proofErr w:type="spellEnd"/>
+      <w:r>
+        <w:t xml:space="preserve"> web. </w:t>
+      </w:r>
+      <w:proofErr w:type="spellStart"/>
+      <w:r>
+        <w:t>Implementasi</w:t>
+      </w:r>
+      <w:proofErr w:type="spellEnd"/>
+      <w:r>
+        <w:t xml:space="preserve"> A*, Dijkstra, dan BFS </w:t>
+      </w:r>
+      <w:proofErr w:type="spellStart"/>
+      <w:r>
+        <w:t>terdapat</w:t>
+      </w:r>
+      <w:proofErr w:type="spellEnd"/>
+      <w:r>
+        <w:t xml:space="preserve"> </w:t>
+      </w:r>
+      <w:proofErr w:type="spellStart"/>
+      <w:r>
+        <w:t>dalam</w:t>
+      </w:r>
+      <w:proofErr w:type="spellEnd"/>
+      <w:r>
+        <w:t xml:space="preserve"> algoritma.py. </w:t>
+      </w:r>
+      <w:proofErr w:type="spellStart"/>
+      <w:r>
+        <w:t>Berkas</w:t>
+      </w:r>
+      <w:proofErr w:type="spellEnd"/>
+      <w:r>
+        <w:t xml:space="preserve"> </w:t>
+      </w:r>
+      <w:proofErr w:type="spellStart"/>
+      <w:r>
+        <w:t>tersebut</w:t>
+      </w:r>
+      <w:proofErr w:type="spellEnd"/>
+      <w:r>
+        <w:t xml:space="preserve"> juga </w:t>
+      </w:r>
+      <w:proofErr w:type="spellStart"/>
+      <w:r>
+        <w:t>menyediakan</w:t>
+      </w:r>
+      <w:proofErr w:type="spellEnd"/>
+      <w:r>
+        <w:t xml:space="preserve"> </w:t>
+      </w:r>
+      <w:proofErr w:type="spellStart"/>
+      <w:r>
+        <w:t>fungsi</w:t>
+      </w:r>
+      <w:proofErr w:type="spellEnd"/>
+      <w:r>
+        <w:t xml:space="preserve"> </w:t>
+      </w:r>
+      <w:proofErr w:type="spellStart"/>
+      <w:r>
+        <w:t>enumerasi</w:t>
+      </w:r>
+      <w:proofErr w:type="spellEnd"/>
+      <w:r>
+        <w:t xml:space="preserve"> </w:t>
+      </w:r>
+      <w:proofErr w:type="spellStart"/>
+      <w:r>
+        <w:t>jalur</w:t>
+      </w:r>
+      <w:proofErr w:type="spellEnd"/>
+      <w:r>
+        <w:t xml:space="preserve"> </w:t>
+      </w:r>
+      <w:proofErr w:type="spellStart"/>
+      <w:r>
+        <w:t>sederhana</w:t>
+      </w:r>
+      <w:proofErr w:type="spellEnd"/>
+      <w:r>
+        <w:t xml:space="preserve"> </w:t>
+      </w:r>
+      <w:proofErr w:type="spellStart"/>
+      <w:r>
+        <w:t>untuk</w:t>
+      </w:r>
+      <w:proofErr w:type="spellEnd"/>
+      <w:r>
+        <w:t xml:space="preserve"> </w:t>
+      </w:r>
+      <w:proofErr w:type="spellStart"/>
+      <w:r>
+        <w:t>menentukan</w:t>
+      </w:r>
+      <w:proofErr w:type="spellEnd"/>
+      <w:r>
+        <w:t xml:space="preserve"> </w:t>
+      </w:r>
+      <w:proofErr w:type="spellStart"/>
+      <w:r>
+        <w:t>biaya</w:t>
+      </w:r>
+      <w:proofErr w:type="spellEnd"/>
+      <w:r>
+        <w:t xml:space="preserve"> minimum </w:t>
+      </w:r>
+      <w:proofErr w:type="spellStart"/>
+      <w:r>
+        <w:t>sebagai</w:t>
+      </w:r>
+      <w:proofErr w:type="spellEnd"/>
+      <w:r>
+        <w:t xml:space="preserve"> </w:t>
+      </w:r>
+      <w:proofErr w:type="spellStart"/>
+      <w:r>
+        <w:t>acuan</w:t>
+      </w:r>
+      <w:proofErr w:type="spellEnd"/>
+      <w:r>
+        <w:t xml:space="preserve">. </w:t>
+      </w:r>
+      <w:proofErr w:type="spellStart"/>
+      <w:r>
+        <w:t>Sementara</w:t>
+      </w:r>
+      <w:proofErr w:type="spellEnd"/>
+      <w:r>
+        <w:t xml:space="preserve"> </w:t>
+      </w:r>
+      <w:proofErr w:type="spellStart"/>
+      <w:r>
+        <w:t>itu</w:t>
+      </w:r>
+      <w:proofErr w:type="spellEnd"/>
+      <w:r>
+        <w:t xml:space="preserve">, data </w:t>
+      </w:r>
+      <w:proofErr w:type="spellStart"/>
+      <w:r>
+        <w:t>jalan</w:t>
+      </w:r>
+      <w:proofErr w:type="spellEnd"/>
+      <w:r>
+        <w:t xml:space="preserve">, </w:t>
+      </w:r>
+      <w:proofErr w:type="spellStart"/>
+      <w:r>
+        <w:t>nilai</w:t>
+      </w:r>
+      <w:proofErr w:type="spellEnd"/>
+      <w:r>
+        <w:t xml:space="preserve"> </w:t>
+      </w:r>
+      <w:proofErr w:type="spellStart"/>
+      <w:r>
+        <w:t>heuristik</w:t>
+      </w:r>
+      <w:proofErr w:type="spellEnd"/>
+      <w:r>
+        <w:t xml:space="preserve">, dan </w:t>
+      </w:r>
+      <w:proofErr w:type="spellStart"/>
+      <w:r>
+        <w:t>pengaturan</w:t>
+      </w:r>
+      <w:proofErr w:type="spellEnd"/>
+      <w:r>
+        <w:t xml:space="preserve"> </w:t>
+      </w:r>
+      <w:proofErr w:type="spellStart"/>
+      <w:r>
+        <w:t>skenario</w:t>
+      </w:r>
+      <w:proofErr w:type="spellEnd"/>
+      <w:r>
+        <w:t xml:space="preserve"> </w:t>
+      </w:r>
+      <w:proofErr w:type="spellStart"/>
+      <w:r>
+        <w:t>ditempatkan</w:t>
+      </w:r>
+      <w:proofErr w:type="spellEnd"/>
+      <w:r>
+        <w:t xml:space="preserve"> </w:t>
+      </w:r>
+      <w:proofErr w:type="spellStart"/>
+      <w:r>
+        <w:t>dalam</w:t>
+      </w:r>
+      <w:proofErr w:type="spellEnd"/>
+      <w:r>
+        <w:t xml:space="preserve"> data_kasus.py.</w:t>
       </w:r>
     </w:p>
     <w:p>
       <w:pPr>
         <w:jc w:val="both"/>
       </w:pPr>
-      <w:r>
-        <w:t>Mulailah dengan memeriksa program utama, yang seharusnya menghasilkan Rumah → Warung → Perpustakaan → Kampus sepanjang 7 km. Berikutnya, uji_kasus.py memproses lima skenario dengan 15 eksekusi. Setelah pemeriksaan berhasil, hasil disimpan sebagai hasil_pengujian.csv dan hasil_pengujian.json pada folder results. Informasi lingkungan pengujian utama dicatat di lingkungan.json.</w:t>
+      <w:proofErr w:type="spellStart"/>
+      <w:r>
+        <w:t>Aplikasi</w:t>
+      </w:r>
+      <w:proofErr w:type="spellEnd"/>
+      <w:r>
+        <w:t xml:space="preserve"> </w:t>
+      </w:r>
+      <w:proofErr w:type="spellStart"/>
+      <w:r>
+        <w:t>dijalankan</w:t>
+      </w:r>
+      <w:proofErr w:type="spellEnd"/>
+      <w:r>
+        <w:t xml:space="preserve"> </w:t>
+      </w:r>
+      <w:proofErr w:type="spellStart"/>
+      <w:r>
+        <w:t>dengan</w:t>
+      </w:r>
+      <w:proofErr w:type="spellEnd"/>
+      <w:r>
+        <w:t xml:space="preserve"> </w:t>
+      </w:r>
+      <w:proofErr w:type="spellStart"/>
+      <w:r>
+        <w:t>mengekstrak</w:t>
+      </w:r>
+      <w:proofErr w:type="spellEnd"/>
+      <w:r>
+        <w:t xml:space="preserve"> </w:t>
+      </w:r>
+      <w:proofErr w:type="spellStart"/>
+      <w:r>
+        <w:t>seluruh</w:t>
+      </w:r>
+      <w:proofErr w:type="spellEnd"/>
+      <w:r>
+        <w:t xml:space="preserve"> </w:t>
+      </w:r>
+      <w:proofErr w:type="spellStart"/>
+      <w:r>
+        <w:t>isi</w:t>
+      </w:r>
+      <w:proofErr w:type="spellEnd"/>
+      <w:r>
+        <w:t xml:space="preserve"> ZIP, </w:t>
+      </w:r>
+      <w:proofErr w:type="spellStart"/>
+      <w:r>
+        <w:t>kemudian</w:t>
+      </w:r>
+      <w:proofErr w:type="spellEnd"/>
+      <w:r>
+        <w:t xml:space="preserve"> </w:t>
+      </w:r>
+      <w:proofErr w:type="spellStart"/>
+      <w:r>
+        <w:t>membuka</w:t>
+      </w:r>
+      <w:proofErr w:type="spellEnd"/>
+      <w:r>
+        <w:t xml:space="preserve"> terminal pada folder </w:t>
+      </w:r>
+      <w:proofErr w:type="spellStart"/>
+      <w:r>
+        <w:t>rute</w:t>
+      </w:r>
+      <w:proofErr w:type="spellEnd"/>
+      <w:r>
+        <w:t xml:space="preserve">-lab-python. </w:t>
+      </w:r>
+      <w:proofErr w:type="spellStart"/>
+      <w:r>
+        <w:t>Gunakan</w:t>
+      </w:r>
+      <w:proofErr w:type="spellEnd"/>
+      <w:r>
+        <w:t xml:space="preserve"> Python </w:t>
+      </w:r>
+      <w:proofErr w:type="spellStart"/>
+      <w:r>
+        <w:t>versi</w:t>
+      </w:r>
+      <w:proofErr w:type="spellEnd"/>
+      <w:r>
+        <w:t xml:space="preserve"> 3.10 </w:t>
+      </w:r>
+      <w:proofErr w:type="spellStart"/>
+      <w:r>
+        <w:t>atau</w:t>
+      </w:r>
+      <w:proofErr w:type="spellEnd"/>
+      <w:r>
+        <w:t xml:space="preserve"> </w:t>
+      </w:r>
+      <w:proofErr w:type="spellStart"/>
+      <w:r>
+        <w:t>lebih</w:t>
+      </w:r>
+      <w:proofErr w:type="spellEnd"/>
+      <w:r>
+        <w:t xml:space="preserve"> </w:t>
+      </w:r>
+      <w:proofErr w:type="spellStart"/>
+      <w:r>
+        <w:t>baru</w:t>
+      </w:r>
+      <w:proofErr w:type="spellEnd"/>
+      <w:r>
+        <w:t xml:space="preserve"> dan </w:t>
+      </w:r>
+      <w:proofErr w:type="spellStart"/>
+      <w:r>
+        <w:t>ketik</w:t>
+      </w:r>
+      <w:proofErr w:type="spellEnd"/>
+      <w:r>
+        <w:t xml:space="preserve"> </w:t>
+      </w:r>
+      <w:proofErr w:type="spellStart"/>
+      <w:r>
+        <w:t>perintah</w:t>
+      </w:r>
+      <w:proofErr w:type="spellEnd"/>
+      <w:r>
+        <w:t xml:space="preserve"> python server.py. </w:t>
+      </w:r>
+      <w:proofErr w:type="spellStart"/>
+      <w:r>
+        <w:t>Pengguna</w:t>
+      </w:r>
+      <w:proofErr w:type="spellEnd"/>
+      <w:r>
+        <w:t xml:space="preserve"> Windows </w:t>
+      </w:r>
+      <w:proofErr w:type="spellStart"/>
+      <w:r>
+        <w:t>dapat</w:t>
+      </w:r>
+      <w:proofErr w:type="spellEnd"/>
+      <w:r>
+        <w:t xml:space="preserve"> </w:t>
+      </w:r>
+      <w:proofErr w:type="spellStart"/>
+      <w:r>
+        <w:t>memakai</w:t>
+      </w:r>
+      <w:proofErr w:type="spellEnd"/>
+      <w:r>
+        <w:t xml:space="preserve"> </w:t>
+      </w:r>
+      <w:proofErr w:type="spellStart"/>
+      <w:r>
+        <w:t>perintah</w:t>
+      </w:r>
+      <w:proofErr w:type="spellEnd"/>
+      <w:r>
+        <w:t xml:space="preserve"> </w:t>
+      </w:r>
+      <w:proofErr w:type="spellStart"/>
+      <w:r>
+        <w:t>py</w:t>
+      </w:r>
+      <w:proofErr w:type="spellEnd"/>
+      <w:r>
+        <w:t xml:space="preserve"> server.py. Setelah server </w:t>
+      </w:r>
+      <w:proofErr w:type="spellStart"/>
+      <w:r>
+        <w:t>berjalan</w:t>
+      </w:r>
+      <w:proofErr w:type="spellEnd"/>
+      <w:r>
+        <w:t xml:space="preserve">, </w:t>
+      </w:r>
+      <w:proofErr w:type="spellStart"/>
+      <w:r>
+        <w:t>akses</w:t>
+      </w:r>
+      <w:proofErr w:type="spellEnd"/>
+      <w:r>
+        <w:t xml:space="preserve"> http://localhost:8000/ </w:t>
+      </w:r>
+      <w:proofErr w:type="spellStart"/>
+      <w:r>
+        <w:t>melalui</w:t>
+      </w:r>
+      <w:proofErr w:type="spellEnd"/>
+      <w:r>
+        <w:t xml:space="preserve"> </w:t>
+      </w:r>
+      <w:proofErr w:type="spellStart"/>
+      <w:r>
+        <w:t>peramban</w:t>
+      </w:r>
+      <w:proofErr w:type="spellEnd"/>
+      <w:r>
+        <w:t xml:space="preserve"> dan </w:t>
+      </w:r>
+      <w:proofErr w:type="spellStart"/>
+      <w:r>
+        <w:t>biarkan</w:t>
+      </w:r>
+      <w:proofErr w:type="spellEnd"/>
+      <w:r>
+        <w:t xml:space="preserve"> terminal </w:t>
+      </w:r>
+      <w:proofErr w:type="spellStart"/>
+      <w:r>
+        <w:t>tetap</w:t>
+      </w:r>
+      <w:proofErr w:type="spellEnd"/>
+      <w:r>
+        <w:t xml:space="preserve"> </w:t>
+      </w:r>
+      <w:proofErr w:type="spellStart"/>
+      <w:r>
+        <w:t>terbuka</w:t>
+      </w:r>
+      <w:proofErr w:type="spellEnd"/>
+      <w:r>
+        <w:t xml:space="preserve">. Program </w:t>
+      </w:r>
+      <w:proofErr w:type="spellStart"/>
+      <w:r>
+        <w:t>ini</w:t>
+      </w:r>
+      <w:proofErr w:type="spellEnd"/>
+      <w:r>
+        <w:t xml:space="preserve"> </w:t>
+      </w:r>
+      <w:proofErr w:type="spellStart"/>
+      <w:r>
+        <w:t>menggunakan</w:t>
+      </w:r>
+      <w:proofErr w:type="spellEnd"/>
+      <w:r>
+        <w:t xml:space="preserve"> </w:t>
+      </w:r>
+      <w:proofErr w:type="spellStart"/>
+      <w:r>
+        <w:t>pustaka</w:t>
+      </w:r>
+      <w:proofErr w:type="spellEnd"/>
+      <w:r>
+        <w:t xml:space="preserve"> </w:t>
+      </w:r>
+      <w:proofErr w:type="spellStart"/>
+      <w:r>
+        <w:t>standar</w:t>
+      </w:r>
+      <w:proofErr w:type="spellEnd"/>
+      <w:r>
+        <w:t xml:space="preserve"> Python </w:t>
+      </w:r>
+      <w:proofErr w:type="spellStart"/>
+      <w:r>
+        <w:t>sehingga</w:t>
+      </w:r>
+      <w:proofErr w:type="spellEnd"/>
+      <w:r>
+        <w:t xml:space="preserve"> </w:t>
+      </w:r>
+      <w:proofErr w:type="spellStart"/>
+      <w:r>
+        <w:t>tidak</w:t>
+      </w:r>
+      <w:proofErr w:type="spellEnd"/>
+      <w:r>
+        <w:t xml:space="preserve"> </w:t>
+      </w:r>
+      <w:proofErr w:type="spellStart"/>
+      <w:r>
+        <w:t>membutuhkan</w:t>
+      </w:r>
+      <w:proofErr w:type="spellEnd"/>
+      <w:r>
+        <w:t xml:space="preserve"> Flask, basis data, </w:t>
+      </w:r>
+      <w:proofErr w:type="spellStart"/>
+      <w:r>
+        <w:t>maupun</w:t>
+      </w:r>
+      <w:proofErr w:type="spellEnd"/>
+      <w:r>
+        <w:t xml:space="preserve"> </w:t>
+      </w:r>
+      <w:proofErr w:type="spellStart"/>
+      <w:r>
+        <w:t>pemasangan</w:t>
+      </w:r>
+      <w:proofErr w:type="spellEnd"/>
+      <w:r>
+        <w:t xml:space="preserve"> </w:t>
+      </w:r>
+      <w:proofErr w:type="spellStart"/>
+      <w:r>
+        <w:t>paket</w:t>
+      </w:r>
+      <w:proofErr w:type="spellEnd"/>
+      <w:r>
+        <w:t xml:space="preserve"> </w:t>
+      </w:r>
+      <w:proofErr w:type="spellStart"/>
+      <w:r>
+        <w:t>tambahan</w:t>
+      </w:r>
+      <w:proofErr w:type="spellEnd"/>
+      <w:r>
+        <w:t>.</w:t>
       </w:r>
     </w:p>
     <w:p>
       <w:pPr>
         <w:jc w:val="both"/>
       </w:pPr>
-      <w:r>
-        <w:t>Sebanyak 35 eksekusi tambahan dijalankan melalui eksperimen_lanjutan.py, dengan keluaran variasi_heuristik.csv, variasi_bobot.csv, dan reopen.json. Kolom biaya memuat jumlah bobot rute, sementara ekspansi menghitung akses daftar tetangga. Pada contoh reopen, satu simpul dapat tercatat lebih dari sekali. Kolom optimum memuat hasil enumerasi sebagai pembanding, bukan nilai estimasi h untuk pencarian.</w:t>
+      <w:proofErr w:type="spellStart"/>
+      <w:r>
+        <w:t>Saat</w:t>
+      </w:r>
+      <w:proofErr w:type="spellEnd"/>
+      <w:r>
+        <w:t xml:space="preserve"> </w:t>
+      </w:r>
+      <w:proofErr w:type="spellStart"/>
+      <w:r>
+        <w:t>halaman</w:t>
+      </w:r>
+      <w:proofErr w:type="spellEnd"/>
+      <w:r>
+        <w:t xml:space="preserve"> </w:t>
+      </w:r>
+      <w:proofErr w:type="spellStart"/>
+      <w:r>
+        <w:t>dibuka</w:t>
+      </w:r>
+      <w:proofErr w:type="spellEnd"/>
+      <w:r>
+        <w:t xml:space="preserve">, </w:t>
+      </w:r>
+      <w:proofErr w:type="spellStart"/>
+      <w:r>
+        <w:t>peramban</w:t>
+      </w:r>
+      <w:proofErr w:type="spellEnd"/>
+      <w:r>
+        <w:t xml:space="preserve"> </w:t>
+      </w:r>
+      <w:proofErr w:type="spellStart"/>
+      <w:r>
+        <w:t>meminta</w:t>
+      </w:r>
+      <w:proofErr w:type="spellEnd"/>
+      <w:r>
+        <w:t xml:space="preserve"> </w:t>
+      </w:r>
+      <w:proofErr w:type="spellStart"/>
+      <w:r>
+        <w:t>hasil</w:t>
+      </w:r>
+      <w:proofErr w:type="spellEnd"/>
+      <w:r>
+        <w:t xml:space="preserve"> </w:t>
+      </w:r>
+      <w:proofErr w:type="spellStart"/>
+      <w:r>
+        <w:t>eksperimen</w:t>
+      </w:r>
+      <w:proofErr w:type="spellEnd"/>
+      <w:r>
+        <w:t xml:space="preserve"> </w:t>
+      </w:r>
+      <w:proofErr w:type="spellStart"/>
+      <w:r>
+        <w:t>melalui</w:t>
+      </w:r>
+      <w:proofErr w:type="spellEnd"/>
+      <w:r>
+        <w:t xml:space="preserve"> endpoint /</w:t>
+      </w:r>
+      <w:proofErr w:type="spellStart"/>
+      <w:r>
+        <w:t>api</w:t>
+      </w:r>
+      <w:proofErr w:type="spellEnd"/>
+      <w:r>
+        <w:t>/</w:t>
+      </w:r>
+      <w:proofErr w:type="spellStart"/>
+      <w:r>
+        <w:t>eksperimen</w:t>
+      </w:r>
+      <w:proofErr w:type="spellEnd"/>
+      <w:r>
+        <w:t xml:space="preserve">. Python </w:t>
+      </w:r>
+      <w:proofErr w:type="spellStart"/>
+      <w:r>
+        <w:t>menjalankan</w:t>
+      </w:r>
+      <w:proofErr w:type="spellEnd"/>
+      <w:r>
+        <w:t xml:space="preserve"> </w:t>
+      </w:r>
+      <w:proofErr w:type="spellStart"/>
+      <w:r>
+        <w:t>algoritma</w:t>
+      </w:r>
+      <w:proofErr w:type="spellEnd"/>
+      <w:r>
+        <w:t xml:space="preserve"> dan </w:t>
+      </w:r>
+      <w:proofErr w:type="spellStart"/>
+      <w:r>
+        <w:t>mengirimkan</w:t>
+      </w:r>
+      <w:proofErr w:type="spellEnd"/>
+      <w:r>
+        <w:t xml:space="preserve"> </w:t>
+      </w:r>
+      <w:proofErr w:type="spellStart"/>
+      <w:r>
+        <w:t>hasilnya</w:t>
+      </w:r>
+      <w:proofErr w:type="spellEnd"/>
+      <w:r>
+        <w:t xml:space="preserve"> </w:t>
+      </w:r>
+      <w:proofErr w:type="spellStart"/>
+      <w:r>
+        <w:t>dalam</w:t>
+      </w:r>
+      <w:proofErr w:type="spellEnd"/>
+      <w:r>
+        <w:t xml:space="preserve"> format JSON. </w:t>
+      </w:r>
+      <w:proofErr w:type="spellStart"/>
+      <w:r>
+        <w:t>Informasi</w:t>
+      </w:r>
+      <w:proofErr w:type="spellEnd"/>
+      <w:r>
+        <w:t xml:space="preserve"> yang </w:t>
+      </w:r>
+      <w:proofErr w:type="spellStart"/>
+      <w:r>
+        <w:t>dikirim</w:t>
+      </w:r>
+      <w:proofErr w:type="spellEnd"/>
+      <w:r>
+        <w:t xml:space="preserve"> </w:t>
+      </w:r>
+      <w:proofErr w:type="spellStart"/>
+      <w:r>
+        <w:t>mencakup</w:t>
+      </w:r>
+      <w:proofErr w:type="spellEnd"/>
+      <w:r>
+        <w:t xml:space="preserve"> </w:t>
+      </w:r>
+      <w:proofErr w:type="spellStart"/>
+      <w:r>
+        <w:t>rute</w:t>
+      </w:r>
+      <w:proofErr w:type="spellEnd"/>
+      <w:r>
+        <w:t xml:space="preserve">, total </w:t>
+      </w:r>
+      <w:proofErr w:type="spellStart"/>
+      <w:r>
+        <w:t>biaya</w:t>
+      </w:r>
+      <w:proofErr w:type="spellEnd"/>
+      <w:r>
+        <w:t xml:space="preserve">, </w:t>
+      </w:r>
+      <w:proofErr w:type="spellStart"/>
+      <w:r>
+        <w:t>simpul</w:t>
+      </w:r>
+      <w:proofErr w:type="spellEnd"/>
+      <w:r>
+        <w:t xml:space="preserve"> yang </w:t>
+      </w:r>
+      <w:proofErr w:type="spellStart"/>
+      <w:r>
+        <w:t>diekspansi</w:t>
+      </w:r>
+      <w:proofErr w:type="spellEnd"/>
+      <w:r>
+        <w:t xml:space="preserve">, dan </w:t>
+      </w:r>
+      <w:proofErr w:type="spellStart"/>
+      <w:r>
+        <w:t>catatan</w:t>
+      </w:r>
+      <w:proofErr w:type="spellEnd"/>
+      <w:r>
+        <w:t xml:space="preserve"> </w:t>
+      </w:r>
+      <w:proofErr w:type="spellStart"/>
+      <w:r>
+        <w:t>langkah</w:t>
+      </w:r>
+      <w:proofErr w:type="spellEnd"/>
+      <w:r>
+        <w:t xml:space="preserve"> </w:t>
+      </w:r>
+      <w:proofErr w:type="spellStart"/>
+      <w:r>
+        <w:t>pencarian</w:t>
+      </w:r>
+      <w:proofErr w:type="spellEnd"/>
+      <w:r>
+        <w:t xml:space="preserve">. JavaScript </w:t>
+      </w:r>
+      <w:proofErr w:type="spellStart"/>
+      <w:r>
+        <w:t>menggunakan</w:t>
+      </w:r>
+      <w:proofErr w:type="spellEnd"/>
+      <w:r>
+        <w:t xml:space="preserve"> </w:t>
+      </w:r>
+      <w:proofErr w:type="spellStart"/>
+      <w:r>
+        <w:t>informasi</w:t>
+      </w:r>
+      <w:proofErr w:type="spellEnd"/>
+      <w:r>
+        <w:t xml:space="preserve"> </w:t>
+      </w:r>
+      <w:proofErr w:type="spellStart"/>
+      <w:r>
+        <w:t>tersebut</w:t>
+      </w:r>
+      <w:proofErr w:type="spellEnd"/>
+      <w:r>
+        <w:t xml:space="preserve"> </w:t>
+      </w:r>
+      <w:proofErr w:type="spellStart"/>
+      <w:r>
+        <w:t>untuk</w:t>
+      </w:r>
+      <w:proofErr w:type="spellEnd"/>
+      <w:r>
+        <w:t xml:space="preserve"> </w:t>
+      </w:r>
+      <w:proofErr w:type="spellStart"/>
+      <w:r>
+        <w:t>menampilkan</w:t>
+      </w:r>
+      <w:proofErr w:type="spellEnd"/>
+      <w:r>
+        <w:t xml:space="preserve"> </w:t>
+      </w:r>
+      <w:proofErr w:type="spellStart"/>
+      <w:r>
+        <w:t>peta</w:t>
+      </w:r>
+      <w:proofErr w:type="spellEnd"/>
+      <w:r>
+        <w:t xml:space="preserve">, </w:t>
+      </w:r>
+      <w:proofErr w:type="spellStart"/>
+      <w:r>
+        <w:t>tabel</w:t>
+      </w:r>
+      <w:proofErr w:type="spellEnd"/>
+      <w:r>
+        <w:t xml:space="preserve">, </w:t>
+      </w:r>
+      <w:proofErr w:type="spellStart"/>
+      <w:r>
+        <w:t>grafik</w:t>
+      </w:r>
+      <w:proofErr w:type="spellEnd"/>
+      <w:r>
+        <w:t xml:space="preserve">, </w:t>
+      </w:r>
+      <w:proofErr w:type="spellStart"/>
+      <w:r>
+        <w:t>serta</w:t>
+      </w:r>
+      <w:proofErr w:type="spellEnd"/>
+      <w:r>
+        <w:t xml:space="preserve"> </w:t>
+      </w:r>
+      <w:proofErr w:type="spellStart"/>
+      <w:r>
+        <w:t>animasi</w:t>
+      </w:r>
+      <w:proofErr w:type="spellEnd"/>
+      <w:r>
+        <w:t xml:space="preserve">. Hasil </w:t>
+      </w:r>
+      <w:proofErr w:type="spellStart"/>
+      <w:r>
+        <w:t>perhitungan</w:t>
+      </w:r>
+      <w:proofErr w:type="spellEnd"/>
+      <w:r>
+        <w:t xml:space="preserve"> </w:t>
+      </w:r>
+      <w:proofErr w:type="spellStart"/>
+      <w:r>
+        <w:t>tidak</w:t>
+      </w:r>
+      <w:proofErr w:type="spellEnd"/>
+      <w:r>
+        <w:t xml:space="preserve"> </w:t>
+      </w:r>
+      <w:proofErr w:type="spellStart"/>
+      <w:r>
+        <w:t>disimpan</w:t>
+      </w:r>
+      <w:proofErr w:type="spellEnd"/>
+      <w:r>
+        <w:t xml:space="preserve"> </w:t>
+      </w:r>
+      <w:proofErr w:type="spellStart"/>
+      <w:r>
+        <w:t>sebagai</w:t>
+      </w:r>
+      <w:proofErr w:type="spellEnd"/>
+      <w:r>
+        <w:t xml:space="preserve"> </w:t>
+      </w:r>
+      <w:proofErr w:type="spellStart"/>
+      <w:r>
+        <w:t>berkas</w:t>
+      </w:r>
+      <w:proofErr w:type="spellEnd"/>
+      <w:r>
+        <w:t xml:space="preserve"> CSV </w:t>
+      </w:r>
+      <w:proofErr w:type="spellStart"/>
+      <w:r>
+        <w:t>atau</w:t>
+      </w:r>
+      <w:proofErr w:type="spellEnd"/>
+      <w:r>
+        <w:t xml:space="preserve"> JSON </w:t>
+      </w:r>
+      <w:proofErr w:type="spellStart"/>
+      <w:r>
+        <w:t>dalam</w:t>
+      </w:r>
+      <w:proofErr w:type="spellEnd"/>
+      <w:r>
+        <w:t xml:space="preserve"> folder program.</w:t>
       </w:r>
     </w:p>
     <w:p>
       <w:pPr>
         <w:jc w:val="both"/>
       </w:pPr>
-      <w:r>
-        <w:t>Angka pada CSV dapat ditinjau memakai aplikasi spreadsheet. Dalam hasil variasi heuristik, h_json menyimpan konfigurasi estimasi lengkap untuk reproduksi. Dalam variasi bobot, setiap w muncul pada tiga baris karena digunakan oleh tiga algoritma. Oleh karena itu, 27 baris pengujian tidak menunjukkan 27 graf berbeda.</w:t>
+      <w:proofErr w:type="spellStart"/>
+      <w:r>
+        <w:t>Pengujian</w:t>
+      </w:r>
+      <w:proofErr w:type="spellEnd"/>
+      <w:r>
+        <w:t xml:space="preserve"> </w:t>
+      </w:r>
+      <w:proofErr w:type="spellStart"/>
+      <w:r>
+        <w:t>utama</w:t>
+      </w:r>
+      <w:proofErr w:type="spellEnd"/>
+      <w:r>
+        <w:t xml:space="preserve"> </w:t>
+      </w:r>
+      <w:proofErr w:type="spellStart"/>
+      <w:r>
+        <w:t>terdiri</w:t>
+      </w:r>
+      <w:proofErr w:type="spellEnd"/>
+      <w:r>
+        <w:t xml:space="preserve"> </w:t>
+      </w:r>
+      <w:proofErr w:type="spellStart"/>
+      <w:r>
+        <w:t>atas</w:t>
+      </w:r>
+      <w:proofErr w:type="spellEnd"/>
+      <w:r>
+        <w:t xml:space="preserve"> lima </w:t>
+      </w:r>
+      <w:proofErr w:type="spellStart"/>
+      <w:r>
+        <w:t>skenario</w:t>
+      </w:r>
+      <w:proofErr w:type="spellEnd"/>
+      <w:r>
+        <w:t xml:space="preserve">, </w:t>
+      </w:r>
+      <w:proofErr w:type="spellStart"/>
+      <w:r>
+        <w:t>yaitu</w:t>
+      </w:r>
+      <w:proofErr w:type="spellEnd"/>
+      <w:r>
+        <w:t xml:space="preserve"> </w:t>
+      </w:r>
+      <w:proofErr w:type="spellStart"/>
+      <w:r>
+        <w:t>kondisi</w:t>
+      </w:r>
+      <w:proofErr w:type="spellEnd"/>
+      <w:r>
+        <w:t xml:space="preserve"> </w:t>
+      </w:r>
+      <w:proofErr w:type="spellStart"/>
+      <w:r>
+        <w:t>jalan</w:t>
+      </w:r>
+      <w:proofErr w:type="spellEnd"/>
+      <w:r>
+        <w:t xml:space="preserve"> normal, </w:t>
+      </w:r>
+      <w:proofErr w:type="spellStart"/>
+      <w:r>
+        <w:t>penutupan</w:t>
+      </w:r>
+      <w:proofErr w:type="spellEnd"/>
+      <w:r>
+        <w:t xml:space="preserve"> </w:t>
+      </w:r>
+      <w:proofErr w:type="spellStart"/>
+      <w:r>
+        <w:t>ruas</w:t>
+      </w:r>
+      <w:proofErr w:type="spellEnd"/>
+      <w:r>
+        <w:t xml:space="preserve"> </w:t>
+      </w:r>
+      <w:proofErr w:type="spellStart"/>
+      <w:r>
+        <w:t>Warung</w:t>
+      </w:r>
+      <w:proofErr w:type="spellEnd"/>
+      <w:r>
+        <w:t>–</w:t>
+      </w:r>
+      <w:proofErr w:type="spellStart"/>
+      <w:r>
+        <w:t>Perpustakaan</w:t>
+      </w:r>
+      <w:proofErr w:type="spellEnd"/>
+      <w:r>
+        <w:t xml:space="preserve">, </w:t>
+      </w:r>
+      <w:proofErr w:type="spellStart"/>
+      <w:r>
+        <w:t>peningkatan</w:t>
+      </w:r>
+      <w:proofErr w:type="spellEnd"/>
+      <w:r>
+        <w:t xml:space="preserve"> </w:t>
+      </w:r>
+      <w:proofErr w:type="spellStart"/>
+      <w:r>
+        <w:t>jarak</w:t>
+      </w:r>
+      <w:proofErr w:type="spellEnd"/>
+      <w:r>
+        <w:t xml:space="preserve"> </w:t>
+      </w:r>
+      <w:proofErr w:type="spellStart"/>
+      <w:r>
+        <w:t>Perpustakaan</w:t>
+      </w:r>
+      <w:proofErr w:type="spellEnd"/>
+      <w:r>
+        <w:t>–</w:t>
+      </w:r>
+      <w:proofErr w:type="spellStart"/>
+      <w:r>
+        <w:t>Kampus</w:t>
+      </w:r>
+      <w:proofErr w:type="spellEnd"/>
+      <w:r>
+        <w:t xml:space="preserve">, </w:t>
+      </w:r>
+      <w:proofErr w:type="spellStart"/>
+      <w:r>
+        <w:t>terputusnya</w:t>
+      </w:r>
+      <w:proofErr w:type="spellEnd"/>
+      <w:r>
+        <w:t xml:space="preserve"> </w:t>
+      </w:r>
+      <w:proofErr w:type="spellStart"/>
+      <w:r>
+        <w:t>seluruh</w:t>
+      </w:r>
+      <w:proofErr w:type="spellEnd"/>
+      <w:r>
+        <w:t xml:space="preserve"> </w:t>
+      </w:r>
+      <w:proofErr w:type="spellStart"/>
+      <w:r>
+        <w:t>akses</w:t>
+      </w:r>
+      <w:proofErr w:type="spellEnd"/>
+      <w:r>
+        <w:t xml:space="preserve"> </w:t>
+      </w:r>
+      <w:proofErr w:type="spellStart"/>
+      <w:r>
+        <w:t>menuju</w:t>
+      </w:r>
+      <w:proofErr w:type="spellEnd"/>
+      <w:r>
+        <w:t xml:space="preserve"> </w:t>
+      </w:r>
+      <w:proofErr w:type="spellStart"/>
+      <w:r>
+        <w:t>Kampus</w:t>
+      </w:r>
+      <w:proofErr w:type="spellEnd"/>
+      <w:r>
+        <w:t xml:space="preserve">, </w:t>
+      </w:r>
+      <w:proofErr w:type="spellStart"/>
+      <w:r>
+        <w:t>serta</w:t>
+      </w:r>
+      <w:proofErr w:type="spellEnd"/>
+      <w:r>
+        <w:t xml:space="preserve"> </w:t>
+      </w:r>
+      <w:proofErr w:type="spellStart"/>
+      <w:r>
+        <w:t>kondisi</w:t>
+      </w:r>
+      <w:proofErr w:type="spellEnd"/>
+      <w:r>
+        <w:t xml:space="preserve"> </w:t>
+      </w:r>
+      <w:proofErr w:type="spellStart"/>
+      <w:r>
+        <w:t>titik</w:t>
+      </w:r>
+      <w:proofErr w:type="spellEnd"/>
+      <w:r>
+        <w:t xml:space="preserve"> </w:t>
+      </w:r>
+      <w:proofErr w:type="spellStart"/>
+      <w:r>
+        <w:t>awal</w:t>
+      </w:r>
+      <w:proofErr w:type="spellEnd"/>
+      <w:r>
+        <w:t xml:space="preserve"> yang </w:t>
+      </w:r>
+      <w:proofErr w:type="spellStart"/>
+      <w:r>
+        <w:t>sama</w:t>
+      </w:r>
+      <w:proofErr w:type="spellEnd"/>
+      <w:r>
+        <w:t xml:space="preserve"> </w:t>
+      </w:r>
+      <w:proofErr w:type="spellStart"/>
+      <w:r>
+        <w:t>dengan</w:t>
+      </w:r>
+      <w:proofErr w:type="spellEnd"/>
+      <w:r>
+        <w:t xml:space="preserve"> </w:t>
+      </w:r>
+      <w:proofErr w:type="spellStart"/>
+      <w:r>
+        <w:t>tujuan</w:t>
+      </w:r>
+      <w:proofErr w:type="spellEnd"/>
+      <w:r>
+        <w:t xml:space="preserve">. </w:t>
+      </w:r>
+      <w:proofErr w:type="spellStart"/>
+      <w:r>
+        <w:t>Setiap</w:t>
+      </w:r>
+      <w:proofErr w:type="spellEnd"/>
+      <w:r>
+        <w:t xml:space="preserve"> </w:t>
+      </w:r>
+      <w:proofErr w:type="spellStart"/>
+      <w:r>
+        <w:t>skenario</w:t>
+      </w:r>
+      <w:proofErr w:type="spellEnd"/>
+      <w:r>
+        <w:t xml:space="preserve"> </w:t>
+      </w:r>
+      <w:proofErr w:type="spellStart"/>
+      <w:r>
+        <w:t>dijalankan</w:t>
+      </w:r>
+      <w:proofErr w:type="spellEnd"/>
+      <w:r>
+        <w:t xml:space="preserve"> </w:t>
+      </w:r>
+      <w:proofErr w:type="spellStart"/>
+      <w:r>
+        <w:t>menggunakan</w:t>
+      </w:r>
+      <w:proofErr w:type="spellEnd"/>
+      <w:r>
+        <w:t xml:space="preserve"> A*, Dijkstra, dan BFS </w:t>
+      </w:r>
+      <w:proofErr w:type="spellStart"/>
+      <w:r>
+        <w:t>sehingga</w:t>
+      </w:r>
+      <w:proofErr w:type="spellEnd"/>
+      <w:r>
+        <w:t xml:space="preserve"> </w:t>
+      </w:r>
+      <w:proofErr w:type="spellStart"/>
+      <w:r>
+        <w:t>terdapat</w:t>
+      </w:r>
+      <w:proofErr w:type="spellEnd"/>
+      <w:r>
+        <w:t xml:space="preserve"> 15 </w:t>
+      </w:r>
+      <w:proofErr w:type="spellStart"/>
+      <w:r>
+        <w:t>eksekusi</w:t>
+      </w:r>
+      <w:proofErr w:type="spellEnd"/>
+      <w:r>
+        <w:t xml:space="preserve">. </w:t>
+      </w:r>
+      <w:proofErr w:type="spellStart"/>
+      <w:r>
+        <w:t>Pengujian</w:t>
+      </w:r>
+      <w:proofErr w:type="spellEnd"/>
+      <w:r>
+        <w:t xml:space="preserve"> </w:t>
+      </w:r>
+      <w:proofErr w:type="spellStart"/>
+      <w:r>
+        <w:t>tambahan</w:t>
+      </w:r>
+      <w:proofErr w:type="spellEnd"/>
+      <w:r>
+        <w:t xml:space="preserve"> </w:t>
+      </w:r>
+      <w:proofErr w:type="spellStart"/>
+      <w:r>
+        <w:t>meliputi</w:t>
+      </w:r>
+      <w:proofErr w:type="spellEnd"/>
+      <w:r>
+        <w:t xml:space="preserve"> </w:t>
+      </w:r>
+      <w:proofErr w:type="spellStart"/>
+      <w:r>
+        <w:t>tujuh</w:t>
+      </w:r>
+      <w:proofErr w:type="spellEnd"/>
+      <w:r>
+        <w:t xml:space="preserve"> </w:t>
+      </w:r>
+      <w:proofErr w:type="spellStart"/>
+      <w:r>
+        <w:t>konfigurasi</w:t>
+      </w:r>
+      <w:proofErr w:type="spellEnd"/>
+      <w:r>
+        <w:t xml:space="preserve"> </w:t>
+      </w:r>
+      <w:proofErr w:type="spellStart"/>
+      <w:r>
+        <w:t>heuristik</w:t>
+      </w:r>
+      <w:proofErr w:type="spellEnd"/>
+      <w:r>
+        <w:t xml:space="preserve"> </w:t>
+      </w:r>
+      <w:proofErr w:type="spellStart"/>
+      <w:r>
+        <w:t>untuk</w:t>
+      </w:r>
+      <w:proofErr w:type="spellEnd"/>
+      <w:r>
+        <w:t xml:space="preserve"> A*, </w:t>
+      </w:r>
+      <w:proofErr w:type="spellStart"/>
+      <w:r>
+        <w:t>sembilan</w:t>
+      </w:r>
+      <w:proofErr w:type="spellEnd"/>
+      <w:r>
+        <w:t xml:space="preserve"> </w:t>
+      </w:r>
+      <w:proofErr w:type="spellStart"/>
+      <w:r>
+        <w:t>variasi</w:t>
+      </w:r>
+      <w:proofErr w:type="spellEnd"/>
+      <w:r>
+        <w:t xml:space="preserve"> </w:t>
+      </w:r>
+      <w:proofErr w:type="spellStart"/>
+      <w:r>
+        <w:t>bobot</w:t>
+      </w:r>
+      <w:proofErr w:type="spellEnd"/>
+      <w:r>
+        <w:t xml:space="preserve"> yang masing-masing </w:t>
+      </w:r>
+      <w:proofErr w:type="spellStart"/>
+      <w:r>
+        <w:t>diperiksa</w:t>
+      </w:r>
+      <w:proofErr w:type="spellEnd"/>
+      <w:r>
+        <w:t xml:space="preserve"> </w:t>
+      </w:r>
+      <w:proofErr w:type="spellStart"/>
+      <w:r>
+        <w:t>menggunakan</w:t>
+      </w:r>
+      <w:proofErr w:type="spellEnd"/>
+      <w:r>
+        <w:t xml:space="preserve"> </w:t>
+      </w:r>
+      <w:proofErr w:type="spellStart"/>
+      <w:r>
+        <w:t>tiga</w:t>
+      </w:r>
+      <w:proofErr w:type="spellEnd"/>
+      <w:r>
+        <w:t xml:space="preserve"> </w:t>
+      </w:r>
+      <w:proofErr w:type="spellStart"/>
+      <w:r>
+        <w:t>algoritma</w:t>
+      </w:r>
+      <w:proofErr w:type="spellEnd"/>
+      <w:r>
+        <w:t xml:space="preserve">, </w:t>
+      </w:r>
+      <w:proofErr w:type="spellStart"/>
+      <w:r>
+        <w:t>serta</w:t>
+      </w:r>
+      <w:proofErr w:type="spellEnd"/>
+      <w:r>
+        <w:t xml:space="preserve"> </w:t>
+      </w:r>
+      <w:proofErr w:type="spellStart"/>
+      <w:r>
+        <w:t>satu</w:t>
+      </w:r>
+      <w:proofErr w:type="spellEnd"/>
+      <w:r>
+        <w:t xml:space="preserve"> </w:t>
+      </w:r>
+      <w:proofErr w:type="spellStart"/>
+      <w:r>
+        <w:t>contoh</w:t>
+      </w:r>
+      <w:proofErr w:type="spellEnd"/>
+      <w:r>
+        <w:t xml:space="preserve"> </w:t>
+      </w:r>
+      <w:proofErr w:type="spellStart"/>
+      <w:r>
+        <w:t>ekspansi</w:t>
+      </w:r>
+      <w:proofErr w:type="spellEnd"/>
+      <w:r>
+        <w:t xml:space="preserve"> </w:t>
+      </w:r>
+      <w:proofErr w:type="spellStart"/>
+      <w:r>
+        <w:t>ulang</w:t>
+      </w:r>
+      <w:proofErr w:type="spellEnd"/>
+      <w:r>
+        <w:t xml:space="preserve">. </w:t>
+      </w:r>
+      <w:proofErr w:type="spellStart"/>
+      <w:r>
+        <w:t>Jumlah</w:t>
+      </w:r>
+      <w:proofErr w:type="spellEnd"/>
+      <w:r>
+        <w:t xml:space="preserve"> </w:t>
+      </w:r>
+      <w:proofErr w:type="spellStart"/>
+      <w:r>
+        <w:t>keseluruhannya</w:t>
+      </w:r>
+      <w:proofErr w:type="spellEnd"/>
+      <w:r>
+        <w:t xml:space="preserve"> </w:t>
+      </w:r>
+      <w:proofErr w:type="spellStart"/>
+      <w:r>
+        <w:t>adalah</w:t>
+      </w:r>
+      <w:proofErr w:type="spellEnd"/>
+      <w:r>
+        <w:t xml:space="preserve"> 50 </w:t>
+      </w:r>
+      <w:proofErr w:type="spellStart"/>
+      <w:r>
+        <w:t>eksekusi</w:t>
+      </w:r>
+      <w:proofErr w:type="spellEnd"/>
+      <w:r>
+        <w:t xml:space="preserve"> </w:t>
+      </w:r>
+      <w:proofErr w:type="spellStart"/>
+      <w:r>
+        <w:t>algoritma</w:t>
+      </w:r>
+      <w:proofErr w:type="spellEnd"/>
+      <w:r>
+        <w:t xml:space="preserve"> </w:t>
+      </w:r>
+      <w:proofErr w:type="spellStart"/>
+      <w:r>
+        <w:t>pencarian</w:t>
+      </w:r>
+      <w:proofErr w:type="spellEnd"/>
+      <w:r>
+        <w:t xml:space="preserve">, </w:t>
+      </w:r>
+      <w:proofErr w:type="spellStart"/>
+      <w:r>
+        <w:t>tidak</w:t>
+      </w:r>
+      <w:proofErr w:type="spellEnd"/>
+      <w:r>
+        <w:t xml:space="preserve"> </w:t>
+      </w:r>
+      <w:proofErr w:type="spellStart"/>
+      <w:r>
+        <w:t>termasuk</w:t>
+      </w:r>
+      <w:proofErr w:type="spellEnd"/>
+      <w:r>
+        <w:t xml:space="preserve"> </w:t>
+      </w:r>
+      <w:proofErr w:type="spellStart"/>
+      <w:r>
+        <w:t>perhitungan</w:t>
+      </w:r>
+      <w:proofErr w:type="spellEnd"/>
+      <w:r>
+        <w:t xml:space="preserve"> </w:t>
+      </w:r>
+      <w:proofErr w:type="spellStart"/>
+      <w:r>
+        <w:t>enumerasi</w:t>
+      </w:r>
+      <w:proofErr w:type="spellEnd"/>
+      <w:r>
+        <w:t xml:space="preserve"> </w:t>
+      </w:r>
+      <w:proofErr w:type="spellStart"/>
+      <w:r>
+        <w:t>sebagai</w:t>
+      </w:r>
+      <w:proofErr w:type="spellEnd"/>
+      <w:r>
+        <w:t xml:space="preserve"> </w:t>
+      </w:r>
+      <w:proofErr w:type="spellStart"/>
+      <w:r>
+        <w:t>acuan</w:t>
+      </w:r>
+      <w:proofErr w:type="spellEnd"/>
+      <w:r>
+        <w:t>.</w:t>
       </w:r>
     </w:p>
     <w:p>
@@ -13849,7 +15280,311 @@
         <w:jc w:val="both"/>
       </w:pPr>
       <w:r>
-        <w:t>Pemeriksaan menggunakan assert, sehingga program harus dijalankan tanpa -O. Opsi tersebut menonaktifkan assert dan dapat membuat program selesai tanpa benar-benar melakukan validasi. Pemanggilan ulang menimpa keluaran di results. Simpan salinan hasil sebelumnya apabila ingin membandingkan perubahan data atau implementasi.</w:t>
+        <w:t xml:space="preserve">Pada </w:t>
+      </w:r>
+      <w:proofErr w:type="spellStart"/>
+      <w:r>
+        <w:t>kondisi</w:t>
+      </w:r>
+      <w:proofErr w:type="spellEnd"/>
+      <w:r>
+        <w:t xml:space="preserve"> </w:t>
+      </w:r>
+      <w:proofErr w:type="spellStart"/>
+      <w:r>
+        <w:t>jalan</w:t>
+      </w:r>
+      <w:proofErr w:type="spellEnd"/>
+      <w:r>
+        <w:t xml:space="preserve"> normal, A* </w:t>
+      </w:r>
+      <w:proofErr w:type="spellStart"/>
+      <w:r>
+        <w:t>menemukan</w:t>
+      </w:r>
+      <w:proofErr w:type="spellEnd"/>
+      <w:r>
+        <w:t xml:space="preserve"> </w:t>
+      </w:r>
+      <w:proofErr w:type="spellStart"/>
+      <w:r>
+        <w:t>rute</w:t>
+      </w:r>
+      <w:proofErr w:type="spellEnd"/>
+      <w:r>
+        <w:t xml:space="preserve"> </w:t>
+      </w:r>
+      <w:proofErr w:type="spellStart"/>
+      <w:r>
+        <w:t>Rumah</w:t>
+      </w:r>
+      <w:proofErr w:type="spellEnd"/>
+      <w:r>
+        <w:t xml:space="preserve"> → </w:t>
+      </w:r>
+      <w:proofErr w:type="spellStart"/>
+      <w:r>
+        <w:t>Warung</w:t>
+      </w:r>
+      <w:proofErr w:type="spellEnd"/>
+      <w:r>
+        <w:t xml:space="preserve"> → </w:t>
+      </w:r>
+      <w:proofErr w:type="spellStart"/>
+      <w:r>
+        <w:t>Perpustakaan</w:t>
+      </w:r>
+      <w:proofErr w:type="spellEnd"/>
+      <w:r>
+        <w:t xml:space="preserve"> → </w:t>
+      </w:r>
+      <w:proofErr w:type="spellStart"/>
+      <w:r>
+        <w:t>Kampus</w:t>
+      </w:r>
+      <w:proofErr w:type="spellEnd"/>
+      <w:r>
+        <w:t xml:space="preserve"> </w:t>
+      </w:r>
+      <w:proofErr w:type="spellStart"/>
+      <w:r>
+        <w:t>dengan</w:t>
+      </w:r>
+      <w:proofErr w:type="spellEnd"/>
+      <w:r>
+        <w:t xml:space="preserve"> total </w:t>
+      </w:r>
+      <w:proofErr w:type="spellStart"/>
+      <w:r>
+        <w:t>jarak</w:t>
+      </w:r>
+      <w:proofErr w:type="spellEnd"/>
+      <w:r>
+        <w:t xml:space="preserve"> 7 km dan </w:t>
+      </w:r>
+      <w:proofErr w:type="spellStart"/>
+      <w:r>
+        <w:t>tiga</w:t>
+      </w:r>
+      <w:proofErr w:type="spellEnd"/>
+      <w:r>
+        <w:t xml:space="preserve"> </w:t>
+      </w:r>
+      <w:proofErr w:type="spellStart"/>
+      <w:r>
+        <w:t>ekspansi</w:t>
+      </w:r>
+      <w:proofErr w:type="spellEnd"/>
+      <w:r>
+        <w:t xml:space="preserve">. Dijkstra </w:t>
+      </w:r>
+      <w:proofErr w:type="spellStart"/>
+      <w:r>
+        <w:t>memperoleh</w:t>
+      </w:r>
+      <w:proofErr w:type="spellEnd"/>
+      <w:r>
+        <w:t xml:space="preserve"> </w:t>
+      </w:r>
+      <w:proofErr w:type="spellStart"/>
+      <w:r>
+        <w:t>jarak</w:t>
+      </w:r>
+      <w:proofErr w:type="spellEnd"/>
+      <w:r>
+        <w:t xml:space="preserve"> yang </w:t>
+      </w:r>
+      <w:proofErr w:type="spellStart"/>
+      <w:r>
+        <w:t>sama</w:t>
+      </w:r>
+      <w:proofErr w:type="spellEnd"/>
+      <w:r>
+        <w:t xml:space="preserve"> </w:t>
+      </w:r>
+      <w:proofErr w:type="spellStart"/>
+      <w:r>
+        <w:t>dengan</w:t>
+      </w:r>
+      <w:proofErr w:type="spellEnd"/>
+      <w:r>
+        <w:t xml:space="preserve"> </w:t>
+      </w:r>
+      <w:proofErr w:type="spellStart"/>
+      <w:r>
+        <w:t>empat</w:t>
+      </w:r>
+      <w:proofErr w:type="spellEnd"/>
+      <w:r>
+        <w:t xml:space="preserve"> </w:t>
+      </w:r>
+      <w:proofErr w:type="spellStart"/>
+      <w:r>
+        <w:t>ekspansi</w:t>
+      </w:r>
+      <w:proofErr w:type="spellEnd"/>
+      <w:r>
+        <w:t xml:space="preserve">. BFS </w:t>
+      </w:r>
+      <w:proofErr w:type="spellStart"/>
+      <w:r>
+        <w:t>memilih</w:t>
+      </w:r>
+      <w:proofErr w:type="spellEnd"/>
+      <w:r>
+        <w:t xml:space="preserve"> </w:t>
+      </w:r>
+      <w:proofErr w:type="spellStart"/>
+      <w:r>
+        <w:t>rute</w:t>
+      </w:r>
+      <w:proofErr w:type="spellEnd"/>
+      <w:r>
+        <w:t xml:space="preserve"> </w:t>
+      </w:r>
+      <w:proofErr w:type="spellStart"/>
+      <w:r>
+        <w:t>Rumah</w:t>
+      </w:r>
+      <w:proofErr w:type="spellEnd"/>
+      <w:r>
+        <w:t xml:space="preserve"> → Taman → </w:t>
+      </w:r>
+      <w:proofErr w:type="spellStart"/>
+      <w:r>
+        <w:t>Kampus</w:t>
+      </w:r>
+      <w:proofErr w:type="spellEnd"/>
+      <w:r>
+        <w:t xml:space="preserve"> </w:t>
+      </w:r>
+      <w:proofErr w:type="spellStart"/>
+      <w:r>
+        <w:t>sepanjang</w:t>
+      </w:r>
+      <w:proofErr w:type="spellEnd"/>
+      <w:r>
+        <w:t xml:space="preserve"> 9 km </w:t>
+      </w:r>
+      <w:proofErr w:type="spellStart"/>
+      <w:r>
+        <w:t>dengan</w:t>
+      </w:r>
+      <w:proofErr w:type="spellEnd"/>
+      <w:r>
+        <w:t xml:space="preserve"> </w:t>
+      </w:r>
+      <w:proofErr w:type="spellStart"/>
+      <w:r>
+        <w:t>empat</w:t>
+      </w:r>
+      <w:proofErr w:type="spellEnd"/>
+      <w:r>
+        <w:t xml:space="preserve"> </w:t>
+      </w:r>
+      <w:proofErr w:type="spellStart"/>
+      <w:r>
+        <w:t>ekspansi</w:t>
+      </w:r>
+      <w:proofErr w:type="spellEnd"/>
+      <w:r>
+        <w:t xml:space="preserve">. Hasil BFS </w:t>
+      </w:r>
+      <w:proofErr w:type="spellStart"/>
+      <w:r>
+        <w:t>berbeda</w:t>
+      </w:r>
+      <w:proofErr w:type="spellEnd"/>
+      <w:r>
+        <w:t xml:space="preserve"> </w:t>
+      </w:r>
+      <w:proofErr w:type="spellStart"/>
+      <w:r>
+        <w:t>karena</w:t>
+      </w:r>
+      <w:proofErr w:type="spellEnd"/>
+      <w:r>
+        <w:t xml:space="preserve"> </w:t>
+      </w:r>
+      <w:proofErr w:type="spellStart"/>
+      <w:r>
+        <w:t>algoritma</w:t>
+      </w:r>
+      <w:proofErr w:type="spellEnd"/>
+      <w:r>
+        <w:t xml:space="preserve"> </w:t>
+      </w:r>
+      <w:proofErr w:type="spellStart"/>
+      <w:r>
+        <w:t>tersebut</w:t>
+      </w:r>
+      <w:proofErr w:type="spellEnd"/>
+      <w:r>
+        <w:t xml:space="preserve"> </w:t>
+      </w:r>
+      <w:proofErr w:type="spellStart"/>
+      <w:r>
+        <w:t>mengutamakan</w:t>
+      </w:r>
+      <w:proofErr w:type="spellEnd"/>
+      <w:r>
+        <w:t xml:space="preserve"> </w:t>
+      </w:r>
+      <w:proofErr w:type="spellStart"/>
+      <w:r>
+        <w:t>jumlah</w:t>
+      </w:r>
+      <w:proofErr w:type="spellEnd"/>
+      <w:r>
+        <w:t xml:space="preserve"> </w:t>
+      </w:r>
+      <w:proofErr w:type="spellStart"/>
+      <w:r>
+        <w:t>ruas</w:t>
+      </w:r>
+      <w:proofErr w:type="spellEnd"/>
+      <w:r>
+        <w:t xml:space="preserve"> paling </w:t>
+      </w:r>
+      <w:proofErr w:type="spellStart"/>
+      <w:r>
+        <w:t>sedikit</w:t>
+      </w:r>
+      <w:proofErr w:type="spellEnd"/>
+      <w:r>
+        <w:t xml:space="preserve">, </w:t>
+      </w:r>
+      <w:proofErr w:type="spellStart"/>
+      <w:r>
+        <w:t>sedangkan</w:t>
+      </w:r>
+      <w:proofErr w:type="spellEnd"/>
+      <w:r>
+        <w:t xml:space="preserve"> A* dan Dijkstra </w:t>
+      </w:r>
+      <w:proofErr w:type="spellStart"/>
+      <w:r>
+        <w:t>memperhitungkan</w:t>
+      </w:r>
+      <w:proofErr w:type="spellEnd"/>
+      <w:r>
+        <w:t xml:space="preserve"> </w:t>
+      </w:r>
+      <w:proofErr w:type="spellStart"/>
+      <w:r>
+        <w:t>bobot</w:t>
+      </w:r>
+      <w:proofErr w:type="spellEnd"/>
+      <w:r>
+        <w:t xml:space="preserve"> </w:t>
+      </w:r>
+      <w:proofErr w:type="spellStart"/>
+      <w:r>
+        <w:t>jarak</w:t>
+      </w:r>
+      <w:proofErr w:type="spellEnd"/>
+      <w:r>
+        <w:t>.</w:t>
       </w:r>
     </w:p>
     <w:p>
@@ -13857,18 +15592,1995 @@
         <w:jc w:val="both"/>
       </w:pPr>
       <w:r>
-        <w:t>Sesudah mengedit graf, tinjau kesesuaian nama simpul, hubungan dua arah, bobot, dan heuristik sebelum menafsirkan keluaran. Asumsi laporan tidak mencakup bobot negatif. Nama tetangga yang tidak tercantum dalam graf atau tabel estimasi dapat menyebabkan kegagalan akses. Kondisi masukan salah ini berbeda dari tujuan terisolasi, yang tetap merupakan graf sah dan semestinya menghasilkan None, None.</w:t>
+        <w:t xml:space="preserve">Nilai </w:t>
+      </w:r>
+      <w:proofErr w:type="spellStart"/>
+      <w:r>
+        <w:t>biaya</w:t>
+      </w:r>
+      <w:proofErr w:type="spellEnd"/>
+      <w:r>
+        <w:t xml:space="preserve"> pada </w:t>
+      </w:r>
+      <w:proofErr w:type="spellStart"/>
+      <w:r>
+        <w:t>tampilan</w:t>
+      </w:r>
+      <w:proofErr w:type="spellEnd"/>
+      <w:r>
+        <w:t xml:space="preserve"> </w:t>
+      </w:r>
+      <w:proofErr w:type="spellStart"/>
+      <w:r>
+        <w:t>merupakan</w:t>
+      </w:r>
+      <w:proofErr w:type="spellEnd"/>
+      <w:r>
+        <w:t xml:space="preserve"> </w:t>
+      </w:r>
+      <w:proofErr w:type="spellStart"/>
+      <w:r>
+        <w:t>hasil</w:t>
+      </w:r>
+      <w:proofErr w:type="spellEnd"/>
+      <w:r>
+        <w:t xml:space="preserve"> </w:t>
+      </w:r>
+      <w:proofErr w:type="spellStart"/>
+      <w:r>
+        <w:t>penjumlahan</w:t>
+      </w:r>
+      <w:proofErr w:type="spellEnd"/>
+      <w:r>
+        <w:t xml:space="preserve"> </w:t>
+      </w:r>
+      <w:proofErr w:type="spellStart"/>
+      <w:r>
+        <w:t>bobot</w:t>
+      </w:r>
+      <w:proofErr w:type="spellEnd"/>
+      <w:r>
+        <w:t xml:space="preserve"> </w:t>
+      </w:r>
+      <w:proofErr w:type="spellStart"/>
+      <w:r>
+        <w:t>ruas</w:t>
+      </w:r>
+      <w:proofErr w:type="spellEnd"/>
+      <w:r>
+        <w:t xml:space="preserve"> yang </w:t>
+      </w:r>
+      <w:proofErr w:type="spellStart"/>
+      <w:r>
+        <w:t>dilalui</w:t>
+      </w:r>
+      <w:proofErr w:type="spellEnd"/>
+      <w:r>
+        <w:t xml:space="preserve">. </w:t>
+      </w:r>
+      <w:proofErr w:type="spellStart"/>
+      <w:r>
+        <w:t>Dalam</w:t>
+      </w:r>
+      <w:proofErr w:type="spellEnd"/>
+      <w:r>
+        <w:t xml:space="preserve"> </w:t>
+      </w:r>
+      <w:proofErr w:type="spellStart"/>
+      <w:r>
+        <w:t>contoh</w:t>
+      </w:r>
+      <w:proofErr w:type="spellEnd"/>
+      <w:r>
+        <w:t xml:space="preserve"> </w:t>
+      </w:r>
+      <w:proofErr w:type="spellStart"/>
+      <w:r>
+        <w:t>ini</w:t>
+      </w:r>
+      <w:proofErr w:type="spellEnd"/>
+      <w:r>
+        <w:t xml:space="preserve">, </w:t>
+      </w:r>
+      <w:proofErr w:type="spellStart"/>
+      <w:r>
+        <w:t>satuan</w:t>
+      </w:r>
+      <w:proofErr w:type="spellEnd"/>
+      <w:r>
+        <w:t xml:space="preserve"> yang </w:t>
+      </w:r>
+      <w:proofErr w:type="spellStart"/>
+      <w:r>
+        <w:t>digunakan</w:t>
+      </w:r>
+      <w:proofErr w:type="spellEnd"/>
+      <w:r>
+        <w:t xml:space="preserve"> </w:t>
+      </w:r>
+      <w:proofErr w:type="spellStart"/>
+      <w:r>
+        <w:t>adalah</w:t>
+      </w:r>
+      <w:proofErr w:type="spellEnd"/>
+      <w:r>
+        <w:t xml:space="preserve"> kilometer. </w:t>
+      </w:r>
+      <w:proofErr w:type="spellStart"/>
+      <w:r>
+        <w:t>Ekspansi</w:t>
+      </w:r>
+      <w:proofErr w:type="spellEnd"/>
+      <w:r>
+        <w:t xml:space="preserve"> </w:t>
+      </w:r>
+      <w:proofErr w:type="spellStart"/>
+      <w:r>
+        <w:t>dihitung</w:t>
+      </w:r>
+      <w:proofErr w:type="spellEnd"/>
+      <w:r>
+        <w:t xml:space="preserve"> </w:t>
+      </w:r>
+      <w:proofErr w:type="spellStart"/>
+      <w:r>
+        <w:t>ketika</w:t>
+      </w:r>
+      <w:proofErr w:type="spellEnd"/>
+      <w:r>
+        <w:t xml:space="preserve"> </w:t>
+      </w:r>
+      <w:proofErr w:type="spellStart"/>
+      <w:r>
+        <w:t>algoritma</w:t>
+      </w:r>
+      <w:proofErr w:type="spellEnd"/>
+      <w:r>
+        <w:t xml:space="preserve"> </w:t>
+      </w:r>
+      <w:proofErr w:type="spellStart"/>
+      <w:r>
+        <w:t>memproses</w:t>
+      </w:r>
+      <w:proofErr w:type="spellEnd"/>
+      <w:r>
+        <w:t xml:space="preserve"> daftar </w:t>
+      </w:r>
+      <w:proofErr w:type="spellStart"/>
+      <w:r>
+        <w:t>tetangga</w:t>
+      </w:r>
+      <w:proofErr w:type="spellEnd"/>
+      <w:r>
+        <w:t xml:space="preserve"> </w:t>
+      </w:r>
+      <w:proofErr w:type="spellStart"/>
+      <w:r>
+        <w:t>suatu</w:t>
+      </w:r>
+      <w:proofErr w:type="spellEnd"/>
+      <w:r>
+        <w:t xml:space="preserve"> </w:t>
+      </w:r>
+      <w:proofErr w:type="spellStart"/>
+      <w:r>
+        <w:t>simpul</w:t>
+      </w:r>
+      <w:proofErr w:type="spellEnd"/>
+      <w:r>
+        <w:t xml:space="preserve">. </w:t>
+      </w:r>
+      <w:proofErr w:type="spellStart"/>
+      <w:r>
+        <w:t>Simpul</w:t>
+      </w:r>
+      <w:proofErr w:type="spellEnd"/>
+      <w:r>
+        <w:t xml:space="preserve"> </w:t>
+      </w:r>
+      <w:proofErr w:type="spellStart"/>
+      <w:r>
+        <w:t>tujuan</w:t>
+      </w:r>
+      <w:proofErr w:type="spellEnd"/>
+      <w:r>
+        <w:t xml:space="preserve"> yang </w:t>
+      </w:r>
+      <w:proofErr w:type="spellStart"/>
+      <w:r>
+        <w:t>langsung</w:t>
+      </w:r>
+      <w:proofErr w:type="spellEnd"/>
+      <w:r>
+        <w:t xml:space="preserve"> </w:t>
+      </w:r>
+      <w:proofErr w:type="spellStart"/>
+      <w:r>
+        <w:t>dikembalikan</w:t>
+      </w:r>
+      <w:proofErr w:type="spellEnd"/>
+      <w:r>
+        <w:t xml:space="preserve"> </w:t>
+      </w:r>
+      <w:proofErr w:type="spellStart"/>
+      <w:r>
+        <w:t>sebagai</w:t>
+      </w:r>
+      <w:proofErr w:type="spellEnd"/>
+      <w:r>
+        <w:t xml:space="preserve"> </w:t>
+      </w:r>
+      <w:proofErr w:type="spellStart"/>
+      <w:r>
+        <w:t>hasil</w:t>
+      </w:r>
+      <w:proofErr w:type="spellEnd"/>
+      <w:r>
+        <w:t xml:space="preserve"> </w:t>
+      </w:r>
+      <w:proofErr w:type="spellStart"/>
+      <w:r>
+        <w:t>tidak</w:t>
+      </w:r>
+      <w:proofErr w:type="spellEnd"/>
+      <w:r>
+        <w:t xml:space="preserve"> </w:t>
+      </w:r>
+      <w:proofErr w:type="spellStart"/>
+      <w:r>
+        <w:t>termasuk</w:t>
+      </w:r>
+      <w:proofErr w:type="spellEnd"/>
+      <w:r>
+        <w:t xml:space="preserve"> </w:t>
+      </w:r>
+      <w:proofErr w:type="spellStart"/>
+      <w:r>
+        <w:t>dalam</w:t>
+      </w:r>
+      <w:proofErr w:type="spellEnd"/>
+      <w:r>
+        <w:t xml:space="preserve"> </w:t>
+      </w:r>
+      <w:proofErr w:type="spellStart"/>
+      <w:r>
+        <w:t>hitungan</w:t>
+      </w:r>
+      <w:proofErr w:type="spellEnd"/>
+      <w:r>
+        <w:t xml:space="preserve"> </w:t>
+      </w:r>
+      <w:proofErr w:type="spellStart"/>
+      <w:r>
+        <w:t>tersebut</w:t>
+      </w:r>
+      <w:proofErr w:type="spellEnd"/>
+      <w:r>
+        <w:t xml:space="preserve">. </w:t>
+      </w:r>
+      <w:proofErr w:type="spellStart"/>
+      <w:r>
+        <w:t>Apabila</w:t>
+      </w:r>
+      <w:proofErr w:type="spellEnd"/>
+      <w:r>
+        <w:t xml:space="preserve"> </w:t>
+      </w:r>
+      <w:proofErr w:type="spellStart"/>
+      <w:r>
+        <w:t>suatu</w:t>
+      </w:r>
+      <w:proofErr w:type="spellEnd"/>
+      <w:r>
+        <w:t xml:space="preserve"> </w:t>
+      </w:r>
+      <w:proofErr w:type="spellStart"/>
+      <w:r>
+        <w:t>simpul</w:t>
+      </w:r>
+      <w:proofErr w:type="spellEnd"/>
+      <w:r>
+        <w:t xml:space="preserve"> </w:t>
+      </w:r>
+      <w:proofErr w:type="spellStart"/>
+      <w:r>
+        <w:t>diproses</w:t>
+      </w:r>
+      <w:proofErr w:type="spellEnd"/>
+      <w:r>
+        <w:t xml:space="preserve"> </w:t>
+      </w:r>
+      <w:proofErr w:type="spellStart"/>
+      <w:r>
+        <w:t>kembali</w:t>
+      </w:r>
+      <w:proofErr w:type="spellEnd"/>
+      <w:r>
+        <w:t xml:space="preserve">, </w:t>
+      </w:r>
+      <w:proofErr w:type="spellStart"/>
+      <w:r>
+        <w:t>seperti</w:t>
+      </w:r>
+      <w:proofErr w:type="spellEnd"/>
+      <w:r>
+        <w:t xml:space="preserve"> pada </w:t>
+      </w:r>
+      <w:proofErr w:type="spellStart"/>
+      <w:r>
+        <w:t>contoh</w:t>
+      </w:r>
+      <w:proofErr w:type="spellEnd"/>
+      <w:r>
+        <w:t xml:space="preserve"> </w:t>
+      </w:r>
+      <w:proofErr w:type="spellStart"/>
+      <w:r>
+        <w:t>ekspansi</w:t>
+      </w:r>
+      <w:proofErr w:type="spellEnd"/>
+      <w:r>
+        <w:t xml:space="preserve"> </w:t>
+      </w:r>
+      <w:proofErr w:type="spellStart"/>
+      <w:r>
+        <w:t>ulang</w:t>
+      </w:r>
+      <w:proofErr w:type="spellEnd"/>
+      <w:r>
+        <w:t xml:space="preserve">, </w:t>
+      </w:r>
+      <w:proofErr w:type="spellStart"/>
+      <w:r>
+        <w:t>simpul</w:t>
+      </w:r>
+      <w:proofErr w:type="spellEnd"/>
+      <w:r>
+        <w:t xml:space="preserve"> </w:t>
+      </w:r>
+      <w:proofErr w:type="spellStart"/>
+      <w:r>
+        <w:t>itu</w:t>
+      </w:r>
+      <w:proofErr w:type="spellEnd"/>
+      <w:r>
+        <w:t xml:space="preserve"> </w:t>
+      </w:r>
+      <w:proofErr w:type="spellStart"/>
+      <w:r>
+        <w:t>dapat</w:t>
+      </w:r>
+      <w:proofErr w:type="spellEnd"/>
+      <w:r>
+        <w:t xml:space="preserve"> </w:t>
+      </w:r>
+      <w:proofErr w:type="spellStart"/>
+      <w:r>
+        <w:t>dihitung</w:t>
+      </w:r>
+      <w:proofErr w:type="spellEnd"/>
+      <w:r>
+        <w:t xml:space="preserve"> </w:t>
+      </w:r>
+      <w:proofErr w:type="spellStart"/>
+      <w:r>
+        <w:t>lebih</w:t>
+      </w:r>
+      <w:proofErr w:type="spellEnd"/>
+      <w:r>
+        <w:t xml:space="preserve"> </w:t>
+      </w:r>
+      <w:proofErr w:type="spellStart"/>
+      <w:r>
+        <w:t>dari</w:t>
+      </w:r>
+      <w:proofErr w:type="spellEnd"/>
+      <w:r>
+        <w:t xml:space="preserve"> </w:t>
+      </w:r>
+      <w:proofErr w:type="spellStart"/>
+      <w:r>
+        <w:t>sekali</w:t>
+      </w:r>
+      <w:proofErr w:type="spellEnd"/>
+      <w:r>
+        <w:t xml:space="preserve">. Adapun </w:t>
+      </w:r>
+      <w:proofErr w:type="spellStart"/>
+      <w:r>
+        <w:t>nilai</w:t>
+      </w:r>
+      <w:proofErr w:type="spellEnd"/>
+      <w:r>
+        <w:t xml:space="preserve"> optimum </w:t>
+      </w:r>
+      <w:proofErr w:type="spellStart"/>
+      <w:r>
+        <w:t>diperoleh</w:t>
+      </w:r>
+      <w:proofErr w:type="spellEnd"/>
+      <w:r>
+        <w:t xml:space="preserve"> </w:t>
+      </w:r>
+      <w:proofErr w:type="spellStart"/>
+      <w:r>
+        <w:t>dengan</w:t>
+      </w:r>
+      <w:proofErr w:type="spellEnd"/>
+      <w:r>
+        <w:t xml:space="preserve"> </w:t>
+      </w:r>
+      <w:proofErr w:type="spellStart"/>
+      <w:r>
+        <w:t>memeriksa</w:t>
+      </w:r>
+      <w:proofErr w:type="spellEnd"/>
+      <w:r>
+        <w:t xml:space="preserve"> </w:t>
+      </w:r>
+      <w:proofErr w:type="spellStart"/>
+      <w:r>
+        <w:t>seluruh</w:t>
+      </w:r>
+      <w:proofErr w:type="spellEnd"/>
+      <w:r>
+        <w:t xml:space="preserve"> </w:t>
+      </w:r>
+      <w:proofErr w:type="spellStart"/>
+      <w:r>
+        <w:t>jalur</w:t>
+      </w:r>
+      <w:proofErr w:type="spellEnd"/>
+      <w:r>
+        <w:t xml:space="preserve"> </w:t>
+      </w:r>
+      <w:proofErr w:type="spellStart"/>
+      <w:r>
+        <w:t>sederhana</w:t>
+      </w:r>
+      <w:proofErr w:type="spellEnd"/>
+      <w:r>
+        <w:t xml:space="preserve"> pada </w:t>
+      </w:r>
+      <w:proofErr w:type="spellStart"/>
+      <w:r>
+        <w:t>graf</w:t>
+      </w:r>
+      <w:proofErr w:type="spellEnd"/>
+      <w:r>
+        <w:t xml:space="preserve"> </w:t>
+      </w:r>
+      <w:proofErr w:type="spellStart"/>
+      <w:r>
+        <w:t>kecil</w:t>
+      </w:r>
+      <w:proofErr w:type="spellEnd"/>
+      <w:r>
+        <w:t xml:space="preserve"> dan </w:t>
+      </w:r>
+      <w:proofErr w:type="spellStart"/>
+      <w:r>
+        <w:t>mengambil</w:t>
+      </w:r>
+      <w:proofErr w:type="spellEnd"/>
+      <w:r>
+        <w:t xml:space="preserve"> </w:t>
+      </w:r>
+      <w:proofErr w:type="spellStart"/>
+      <w:r>
+        <w:t>biaya</w:t>
+      </w:r>
+      <w:proofErr w:type="spellEnd"/>
+      <w:r>
+        <w:t xml:space="preserve"> </w:t>
+      </w:r>
+      <w:proofErr w:type="spellStart"/>
+      <w:r>
+        <w:t>terkecil</w:t>
+      </w:r>
+      <w:proofErr w:type="spellEnd"/>
+      <w:r>
+        <w:t>.</w:t>
       </w:r>
     </w:p>
     <w:p>
       <w:pPr>
         <w:jc w:val="both"/>
       </w:pPr>
-      <w:r>
-        <w:t xml:space="preserve">Matplotlib diperlukan untuk menghasilkan ulang visual, sedangkan pencarian dan skrip pengujian memakai pustaka standar. Rincian perintah tersedia dalam README.md. </w:t>
-      </w:r>
-      <w:r>
-        <w:t>Keterangan repositori dapat dilengkapi setelah penyusun mengunggah paket program.</w:t>
+      <w:proofErr w:type="spellStart"/>
+      <w:r>
+        <w:t>Untuk</w:t>
+      </w:r>
+      <w:proofErr w:type="spellEnd"/>
+      <w:r>
+        <w:t xml:space="preserve"> </w:t>
+      </w:r>
+      <w:proofErr w:type="spellStart"/>
+      <w:r>
+        <w:t>memeriksa</w:t>
+      </w:r>
+      <w:proofErr w:type="spellEnd"/>
+      <w:r>
+        <w:t xml:space="preserve"> </w:t>
+      </w:r>
+      <w:proofErr w:type="spellStart"/>
+      <w:r>
+        <w:t>hasil</w:t>
+      </w:r>
+      <w:proofErr w:type="spellEnd"/>
+      <w:r>
+        <w:t xml:space="preserve"> program, </w:t>
+      </w:r>
+      <w:proofErr w:type="spellStart"/>
+      <w:r>
+        <w:t>jalankan</w:t>
+      </w:r>
+      <w:proofErr w:type="spellEnd"/>
+      <w:r>
+        <w:t xml:space="preserve"> </w:t>
+      </w:r>
+      <w:proofErr w:type="spellStart"/>
+      <w:r>
+        <w:t>perintah</w:t>
+      </w:r>
+      <w:proofErr w:type="spellEnd"/>
+      <w:r>
+        <w:t xml:space="preserve"> python uji_backend.py </w:t>
+      </w:r>
+      <w:proofErr w:type="spellStart"/>
+      <w:r>
+        <w:t>atau</w:t>
+      </w:r>
+      <w:proofErr w:type="spellEnd"/>
+      <w:r>
+        <w:t xml:space="preserve"> </w:t>
+      </w:r>
+      <w:proofErr w:type="spellStart"/>
+      <w:r>
+        <w:t>py</w:t>
+      </w:r>
+      <w:proofErr w:type="spellEnd"/>
+      <w:r>
+        <w:t xml:space="preserve"> uji_backend.py. </w:t>
+      </w:r>
+      <w:proofErr w:type="spellStart"/>
+      <w:r>
+        <w:t>Pemeriksaan</w:t>
+      </w:r>
+      <w:proofErr w:type="spellEnd"/>
+      <w:r>
+        <w:t xml:space="preserve"> </w:t>
+      </w:r>
+      <w:proofErr w:type="spellStart"/>
+      <w:r>
+        <w:t>mencakup</w:t>
+      </w:r>
+      <w:proofErr w:type="spellEnd"/>
+      <w:r>
+        <w:t xml:space="preserve"> </w:t>
+      </w:r>
+      <w:proofErr w:type="spellStart"/>
+      <w:r>
+        <w:t>ketepatan</w:t>
+      </w:r>
+      <w:proofErr w:type="spellEnd"/>
+      <w:r>
+        <w:t xml:space="preserve"> </w:t>
+      </w:r>
+      <w:proofErr w:type="spellStart"/>
+      <w:r>
+        <w:t>titik</w:t>
+      </w:r>
+      <w:proofErr w:type="spellEnd"/>
+      <w:r>
+        <w:t xml:space="preserve"> </w:t>
+      </w:r>
+      <w:proofErr w:type="spellStart"/>
+      <w:r>
+        <w:t>awal</w:t>
+      </w:r>
+      <w:proofErr w:type="spellEnd"/>
+      <w:r>
+        <w:t xml:space="preserve"> dan </w:t>
+      </w:r>
+      <w:proofErr w:type="spellStart"/>
+      <w:r>
+        <w:t>tujuan</w:t>
+      </w:r>
+      <w:proofErr w:type="spellEnd"/>
+      <w:r>
+        <w:t xml:space="preserve">, </w:t>
+      </w:r>
+      <w:proofErr w:type="spellStart"/>
+      <w:r>
+        <w:t>kesesuaian</w:t>
+      </w:r>
+      <w:proofErr w:type="spellEnd"/>
+      <w:r>
+        <w:t xml:space="preserve"> total </w:t>
+      </w:r>
+      <w:proofErr w:type="spellStart"/>
+      <w:r>
+        <w:t>biaya</w:t>
+      </w:r>
+      <w:proofErr w:type="spellEnd"/>
+      <w:r>
+        <w:t xml:space="preserve"> </w:t>
+      </w:r>
+      <w:proofErr w:type="spellStart"/>
+      <w:r>
+        <w:t>dengan</w:t>
+      </w:r>
+      <w:proofErr w:type="spellEnd"/>
+      <w:r>
+        <w:t xml:space="preserve"> </w:t>
+      </w:r>
+      <w:proofErr w:type="spellStart"/>
+      <w:r>
+        <w:t>ruas</w:t>
+      </w:r>
+      <w:proofErr w:type="spellEnd"/>
+      <w:r>
+        <w:t xml:space="preserve"> yang </w:t>
+      </w:r>
+      <w:proofErr w:type="spellStart"/>
+      <w:r>
+        <w:t>dilalui</w:t>
+      </w:r>
+      <w:proofErr w:type="spellEnd"/>
+      <w:r>
+        <w:t xml:space="preserve">, </w:t>
+      </w:r>
+      <w:proofErr w:type="spellStart"/>
+      <w:r>
+        <w:t>serta</w:t>
+      </w:r>
+      <w:proofErr w:type="spellEnd"/>
+      <w:r>
+        <w:t xml:space="preserve"> </w:t>
+      </w:r>
+      <w:proofErr w:type="spellStart"/>
+      <w:r>
+        <w:t>kecocokan</w:t>
+      </w:r>
+      <w:proofErr w:type="spellEnd"/>
+      <w:r>
+        <w:t xml:space="preserve"> </w:t>
+      </w:r>
+      <w:proofErr w:type="spellStart"/>
+      <w:r>
+        <w:t>jumlah</w:t>
+      </w:r>
+      <w:proofErr w:type="spellEnd"/>
+      <w:r>
+        <w:t xml:space="preserve"> </w:t>
+      </w:r>
+      <w:proofErr w:type="spellStart"/>
+      <w:r>
+        <w:t>ekspansi</w:t>
+      </w:r>
+      <w:proofErr w:type="spellEnd"/>
+      <w:r>
+        <w:t xml:space="preserve"> </w:t>
+      </w:r>
+      <w:proofErr w:type="spellStart"/>
+      <w:r>
+        <w:t>dengan</w:t>
+      </w:r>
+      <w:proofErr w:type="spellEnd"/>
+      <w:r>
+        <w:t xml:space="preserve"> </w:t>
+      </w:r>
+      <w:proofErr w:type="spellStart"/>
+      <w:r>
+        <w:t>catatan</w:t>
+      </w:r>
+      <w:proofErr w:type="spellEnd"/>
+      <w:r>
+        <w:t xml:space="preserve"> proses </w:t>
+      </w:r>
+      <w:proofErr w:type="spellStart"/>
+      <w:r>
+        <w:t>pencarian</w:t>
+      </w:r>
+      <w:proofErr w:type="spellEnd"/>
+      <w:r>
+        <w:t xml:space="preserve">. </w:t>
+      </w:r>
+      <w:proofErr w:type="spellStart"/>
+      <w:r>
+        <w:t>Biaya</w:t>
+      </w:r>
+      <w:proofErr w:type="spellEnd"/>
+      <w:r>
+        <w:t xml:space="preserve"> A* dan Dijkstra juga </w:t>
+      </w:r>
+      <w:proofErr w:type="spellStart"/>
+      <w:r>
+        <w:t>dibandingkan</w:t>
+      </w:r>
+      <w:proofErr w:type="spellEnd"/>
+      <w:r>
+        <w:t xml:space="preserve"> </w:t>
+      </w:r>
+      <w:proofErr w:type="spellStart"/>
+      <w:r>
+        <w:t>dengan</w:t>
+      </w:r>
+      <w:proofErr w:type="spellEnd"/>
+      <w:r>
+        <w:t xml:space="preserve"> </w:t>
+      </w:r>
+      <w:proofErr w:type="spellStart"/>
+      <w:r>
+        <w:t>nilai</w:t>
+      </w:r>
+      <w:proofErr w:type="spellEnd"/>
+      <w:r>
+        <w:t xml:space="preserve"> optimum, </w:t>
+      </w:r>
+      <w:proofErr w:type="spellStart"/>
+      <w:r>
+        <w:t>kecuali</w:t>
+      </w:r>
+      <w:proofErr w:type="spellEnd"/>
+      <w:r>
+        <w:t xml:space="preserve"> pada </w:t>
+      </w:r>
+      <w:proofErr w:type="spellStart"/>
+      <w:r>
+        <w:t>konfigurasi</w:t>
+      </w:r>
+      <w:proofErr w:type="spellEnd"/>
+      <w:r>
+        <w:t xml:space="preserve"> H6 yang </w:t>
+      </w:r>
+      <w:proofErr w:type="spellStart"/>
+      <w:r>
+        <w:t>sengaja</w:t>
+      </w:r>
+      <w:proofErr w:type="spellEnd"/>
+      <w:r>
+        <w:t xml:space="preserve"> </w:t>
+      </w:r>
+      <w:proofErr w:type="spellStart"/>
+      <w:r>
+        <w:t>menggunakan</w:t>
+      </w:r>
+      <w:proofErr w:type="spellEnd"/>
+      <w:r>
+        <w:t xml:space="preserve"> </w:t>
+      </w:r>
+      <w:proofErr w:type="spellStart"/>
+      <w:r>
+        <w:t>heuristik</w:t>
+      </w:r>
+      <w:proofErr w:type="spellEnd"/>
+      <w:r>
+        <w:t xml:space="preserve"> </w:t>
+      </w:r>
+      <w:proofErr w:type="spellStart"/>
+      <w:r>
+        <w:t>berlebih</w:t>
+      </w:r>
+      <w:proofErr w:type="spellEnd"/>
+      <w:r>
+        <w:t xml:space="preserve">. Jika </w:t>
+      </w:r>
+      <w:proofErr w:type="spellStart"/>
+      <w:r>
+        <w:t>seluruh</w:t>
+      </w:r>
+      <w:proofErr w:type="spellEnd"/>
+      <w:r>
+        <w:t xml:space="preserve"> </w:t>
+      </w:r>
+      <w:proofErr w:type="spellStart"/>
+      <w:r>
+        <w:t>pemeriksaan</w:t>
+      </w:r>
+      <w:proofErr w:type="spellEnd"/>
+      <w:r>
+        <w:t xml:space="preserve"> </w:t>
+      </w:r>
+      <w:proofErr w:type="spellStart"/>
+      <w:r>
+        <w:t>berhasil</w:t>
+      </w:r>
+      <w:proofErr w:type="spellEnd"/>
+      <w:r>
+        <w:t xml:space="preserve">, terminal </w:t>
+      </w:r>
+      <w:proofErr w:type="spellStart"/>
+      <w:r>
+        <w:t>menampilkan</w:t>
+      </w:r>
+      <w:proofErr w:type="spellEnd"/>
+      <w:r>
+        <w:t xml:space="preserve"> </w:t>
+      </w:r>
+      <w:proofErr w:type="spellStart"/>
+      <w:r>
+        <w:t>pesan</w:t>
+      </w:r>
+      <w:proofErr w:type="spellEnd"/>
+      <w:r>
+        <w:t xml:space="preserve"> “LULUS: 50 </w:t>
+      </w:r>
+      <w:proofErr w:type="spellStart"/>
+      <w:r>
+        <w:t>eksekusi</w:t>
+      </w:r>
+      <w:proofErr w:type="spellEnd"/>
+      <w:r>
+        <w:t xml:space="preserve"> Python, </w:t>
+      </w:r>
+      <w:proofErr w:type="spellStart"/>
+      <w:r>
+        <w:t>biaya</w:t>
+      </w:r>
+      <w:proofErr w:type="spellEnd"/>
+      <w:r>
+        <w:t xml:space="preserve">, </w:t>
+      </w:r>
+      <w:proofErr w:type="spellStart"/>
+      <w:r>
+        <w:t>keabsahan</w:t>
+      </w:r>
+      <w:proofErr w:type="spellEnd"/>
+      <w:r>
+        <w:t xml:space="preserve"> </w:t>
+      </w:r>
+      <w:proofErr w:type="spellStart"/>
+      <w:r>
+        <w:t>rute</w:t>
+      </w:r>
+      <w:proofErr w:type="spellEnd"/>
+      <w:r>
+        <w:t xml:space="preserve">, dan </w:t>
+      </w:r>
+      <w:proofErr w:type="spellStart"/>
+      <w:r>
+        <w:t>jumlah</w:t>
+      </w:r>
+      <w:proofErr w:type="spellEnd"/>
+      <w:r>
+        <w:t xml:space="preserve"> </w:t>
+      </w:r>
+      <w:proofErr w:type="spellStart"/>
+      <w:r>
+        <w:t>ekspansi</w:t>
+      </w:r>
+      <w:proofErr w:type="spellEnd"/>
+      <w:r>
+        <w:t xml:space="preserve">.” </w:t>
+      </w:r>
+      <w:proofErr w:type="spellStart"/>
+      <w:r>
+        <w:t>Jalankan</w:t>
+      </w:r>
+      <w:proofErr w:type="spellEnd"/>
+      <w:r>
+        <w:t xml:space="preserve"> </w:t>
+      </w:r>
+      <w:proofErr w:type="spellStart"/>
+      <w:r>
+        <w:t>pengujian</w:t>
+      </w:r>
+      <w:proofErr w:type="spellEnd"/>
+      <w:r>
+        <w:t xml:space="preserve"> </w:t>
+      </w:r>
+      <w:proofErr w:type="spellStart"/>
+      <w:r>
+        <w:t>tanpa</w:t>
+      </w:r>
+      <w:proofErr w:type="spellEnd"/>
+      <w:r>
+        <w:t xml:space="preserve"> </w:t>
+      </w:r>
+      <w:proofErr w:type="spellStart"/>
+      <w:r>
+        <w:t>opsi</w:t>
+      </w:r>
+      <w:proofErr w:type="spellEnd"/>
+      <w:r>
+        <w:t xml:space="preserve"> -O </w:t>
+      </w:r>
+      <w:proofErr w:type="spellStart"/>
+      <w:r>
+        <w:t>karena</w:t>
+      </w:r>
+      <w:proofErr w:type="spellEnd"/>
+      <w:r>
+        <w:t xml:space="preserve"> </w:t>
+      </w:r>
+      <w:proofErr w:type="spellStart"/>
+      <w:r>
+        <w:t>opsi</w:t>
+      </w:r>
+      <w:proofErr w:type="spellEnd"/>
+      <w:r>
+        <w:t xml:space="preserve"> </w:t>
+      </w:r>
+      <w:proofErr w:type="spellStart"/>
+      <w:r>
+        <w:t>tersebut</w:t>
+      </w:r>
+      <w:proofErr w:type="spellEnd"/>
+      <w:r>
+        <w:t xml:space="preserve"> </w:t>
+      </w:r>
+      <w:proofErr w:type="spellStart"/>
+      <w:r>
+        <w:t>menonaktifkan</w:t>
+      </w:r>
+      <w:proofErr w:type="spellEnd"/>
+      <w:r>
+        <w:t xml:space="preserve"> </w:t>
+      </w:r>
+      <w:proofErr w:type="spellStart"/>
+      <w:r>
+        <w:t>pemeriksaan</w:t>
+      </w:r>
+      <w:proofErr w:type="spellEnd"/>
+      <w:r>
+        <w:t xml:space="preserve"> assert.</w:t>
+      </w:r>
+    </w:p>
+    <w:p>
+      <w:pPr>
+        <w:jc w:val="both"/>
+      </w:pPr>
+      <w:proofErr w:type="spellStart"/>
+      <w:r>
+        <w:t>Konfigurasi</w:t>
+      </w:r>
+      <w:proofErr w:type="spellEnd"/>
+      <w:r>
+        <w:t xml:space="preserve"> H6 </w:t>
+      </w:r>
+      <w:proofErr w:type="spellStart"/>
+      <w:r>
+        <w:t>digunakan</w:t>
+      </w:r>
+      <w:proofErr w:type="spellEnd"/>
+      <w:r>
+        <w:t xml:space="preserve"> </w:t>
+      </w:r>
+      <w:proofErr w:type="spellStart"/>
+      <w:r>
+        <w:t>untuk</w:t>
+      </w:r>
+      <w:proofErr w:type="spellEnd"/>
+      <w:r>
+        <w:t xml:space="preserve"> </w:t>
+      </w:r>
+      <w:proofErr w:type="spellStart"/>
+      <w:r>
+        <w:t>menunjukkan</w:t>
+      </w:r>
+      <w:proofErr w:type="spellEnd"/>
+      <w:r>
+        <w:t xml:space="preserve"> </w:t>
+      </w:r>
+      <w:proofErr w:type="spellStart"/>
+      <w:r>
+        <w:t>bahwa</w:t>
+      </w:r>
+      <w:proofErr w:type="spellEnd"/>
+      <w:r>
+        <w:t xml:space="preserve"> </w:t>
+      </w:r>
+      <w:proofErr w:type="spellStart"/>
+      <w:r>
+        <w:t>estimasi</w:t>
+      </w:r>
+      <w:proofErr w:type="spellEnd"/>
+      <w:r>
+        <w:t xml:space="preserve"> yang </w:t>
+      </w:r>
+      <w:proofErr w:type="spellStart"/>
+      <w:r>
+        <w:t>terlalu</w:t>
+      </w:r>
+      <w:proofErr w:type="spellEnd"/>
+      <w:r>
+        <w:t xml:space="preserve"> </w:t>
+      </w:r>
+      <w:proofErr w:type="spellStart"/>
+      <w:r>
+        <w:t>besar</w:t>
+      </w:r>
+      <w:proofErr w:type="spellEnd"/>
+      <w:r>
+        <w:t xml:space="preserve"> </w:t>
+      </w:r>
+      <w:proofErr w:type="spellStart"/>
+      <w:r>
+        <w:t>dapat</w:t>
+      </w:r>
+      <w:proofErr w:type="spellEnd"/>
+      <w:r>
+        <w:t xml:space="preserve"> </w:t>
+      </w:r>
+      <w:proofErr w:type="spellStart"/>
+      <w:r>
+        <w:t>menyebabkan</w:t>
+      </w:r>
+      <w:proofErr w:type="spellEnd"/>
+      <w:r>
+        <w:t xml:space="preserve"> A* </w:t>
+      </w:r>
+      <w:proofErr w:type="spellStart"/>
+      <w:r>
+        <w:t>menghasilkan</w:t>
+      </w:r>
+      <w:proofErr w:type="spellEnd"/>
+      <w:r>
+        <w:t xml:space="preserve"> </w:t>
+      </w:r>
+      <w:proofErr w:type="spellStart"/>
+      <w:r>
+        <w:t>rute</w:t>
+      </w:r>
+      <w:proofErr w:type="spellEnd"/>
+      <w:r>
+        <w:t xml:space="preserve"> yang </w:t>
+      </w:r>
+      <w:proofErr w:type="spellStart"/>
+      <w:r>
+        <w:t>tidak</w:t>
+      </w:r>
+      <w:proofErr w:type="spellEnd"/>
+      <w:r>
+        <w:t xml:space="preserve"> optimal. Pada </w:t>
+      </w:r>
+      <w:proofErr w:type="spellStart"/>
+      <w:r>
+        <w:t>contoh</w:t>
+      </w:r>
+      <w:proofErr w:type="spellEnd"/>
+      <w:r>
+        <w:t xml:space="preserve"> </w:t>
+      </w:r>
+      <w:proofErr w:type="spellStart"/>
+      <w:r>
+        <w:t>tersebut</w:t>
+      </w:r>
+      <w:proofErr w:type="spellEnd"/>
+      <w:r>
+        <w:t xml:space="preserve">, </w:t>
+      </w:r>
+      <w:proofErr w:type="spellStart"/>
+      <w:r>
+        <w:t>jarak</w:t>
+      </w:r>
+      <w:proofErr w:type="spellEnd"/>
+      <w:r>
+        <w:t xml:space="preserve"> yang </w:t>
+      </w:r>
+      <w:proofErr w:type="spellStart"/>
+      <w:r>
+        <w:t>diperoleh</w:t>
+      </w:r>
+      <w:proofErr w:type="spellEnd"/>
+      <w:r>
+        <w:t xml:space="preserve"> </w:t>
+      </w:r>
+      <w:proofErr w:type="spellStart"/>
+      <w:r>
+        <w:t>adalah</w:t>
+      </w:r>
+      <w:proofErr w:type="spellEnd"/>
+      <w:r>
+        <w:t xml:space="preserve"> 9 km, </w:t>
+      </w:r>
+      <w:proofErr w:type="spellStart"/>
+      <w:r>
+        <w:t>sementara</w:t>
+      </w:r>
+      <w:proofErr w:type="spellEnd"/>
+      <w:r>
+        <w:t xml:space="preserve"> </w:t>
+      </w:r>
+      <w:proofErr w:type="spellStart"/>
+      <w:r>
+        <w:t>jarak</w:t>
+      </w:r>
+      <w:proofErr w:type="spellEnd"/>
+      <w:r>
+        <w:t xml:space="preserve"> </w:t>
+      </w:r>
+      <w:proofErr w:type="spellStart"/>
+      <w:r>
+        <w:t>minimumnya</w:t>
+      </w:r>
+      <w:proofErr w:type="spellEnd"/>
+      <w:r>
+        <w:t xml:space="preserve"> 7 km. </w:t>
+      </w:r>
+      <w:proofErr w:type="spellStart"/>
+      <w:r>
+        <w:t>Contoh</w:t>
+      </w:r>
+      <w:proofErr w:type="spellEnd"/>
+      <w:r>
+        <w:t xml:space="preserve"> </w:t>
+      </w:r>
+      <w:proofErr w:type="spellStart"/>
+      <w:r>
+        <w:t>ekspansi</w:t>
+      </w:r>
+      <w:proofErr w:type="spellEnd"/>
+      <w:r>
+        <w:t xml:space="preserve"> </w:t>
+      </w:r>
+      <w:proofErr w:type="spellStart"/>
+      <w:r>
+        <w:t>ulang</w:t>
+      </w:r>
+      <w:proofErr w:type="spellEnd"/>
+      <w:r>
+        <w:t xml:space="preserve"> </w:t>
+      </w:r>
+      <w:proofErr w:type="spellStart"/>
+      <w:r>
+        <w:t>memperlihatkan</w:t>
+      </w:r>
+      <w:proofErr w:type="spellEnd"/>
+      <w:r>
+        <w:t xml:space="preserve"> </w:t>
+      </w:r>
+      <w:proofErr w:type="spellStart"/>
+      <w:r>
+        <w:t>urutan</w:t>
+      </w:r>
+      <w:proofErr w:type="spellEnd"/>
+      <w:r>
+        <w:t xml:space="preserve"> </w:t>
+      </w:r>
+      <w:proofErr w:type="spellStart"/>
+      <w:r>
+        <w:t>pemrosesan</w:t>
+      </w:r>
+      <w:proofErr w:type="spellEnd"/>
+      <w:r>
+        <w:t xml:space="preserve"> S → A → B → A </w:t>
+      </w:r>
+      <w:proofErr w:type="spellStart"/>
+      <w:r>
+        <w:t>dengan</w:t>
+      </w:r>
+      <w:proofErr w:type="spellEnd"/>
+      <w:r>
+        <w:t xml:space="preserve"> </w:t>
+      </w:r>
+      <w:proofErr w:type="spellStart"/>
+      <w:r>
+        <w:t>biaya</w:t>
+      </w:r>
+      <w:proofErr w:type="spellEnd"/>
+      <w:r>
+        <w:t xml:space="preserve"> </w:t>
+      </w:r>
+      <w:proofErr w:type="spellStart"/>
+      <w:r>
+        <w:t>akhir</w:t>
+      </w:r>
+      <w:proofErr w:type="spellEnd"/>
+      <w:r>
+        <w:t xml:space="preserve"> 4. </w:t>
+      </w:r>
+      <w:proofErr w:type="spellStart"/>
+      <w:r>
+        <w:t>Urutan</w:t>
+      </w:r>
+      <w:proofErr w:type="spellEnd"/>
+      <w:r>
+        <w:t xml:space="preserve"> </w:t>
+      </w:r>
+      <w:proofErr w:type="spellStart"/>
+      <w:r>
+        <w:t>tersebut</w:t>
+      </w:r>
+      <w:proofErr w:type="spellEnd"/>
+      <w:r>
+        <w:t xml:space="preserve"> </w:t>
+      </w:r>
+      <w:proofErr w:type="spellStart"/>
+      <w:r>
+        <w:t>menunjukkan</w:t>
+      </w:r>
+      <w:proofErr w:type="spellEnd"/>
+      <w:r>
+        <w:t xml:space="preserve"> </w:t>
+      </w:r>
+      <w:proofErr w:type="spellStart"/>
+      <w:r>
+        <w:t>bahwa</w:t>
+      </w:r>
+      <w:proofErr w:type="spellEnd"/>
+      <w:r>
+        <w:t xml:space="preserve"> </w:t>
+      </w:r>
+      <w:proofErr w:type="spellStart"/>
+      <w:r>
+        <w:t>simpul</w:t>
+      </w:r>
+      <w:proofErr w:type="spellEnd"/>
+      <w:r>
+        <w:t xml:space="preserve"> A </w:t>
+      </w:r>
+      <w:proofErr w:type="spellStart"/>
+      <w:r>
+        <w:t>diproses</w:t>
+      </w:r>
+      <w:proofErr w:type="spellEnd"/>
+      <w:r>
+        <w:t xml:space="preserve"> </w:t>
+      </w:r>
+      <w:proofErr w:type="spellStart"/>
+      <w:r>
+        <w:t>kembali</w:t>
+      </w:r>
+      <w:proofErr w:type="spellEnd"/>
+      <w:r>
+        <w:t xml:space="preserve"> </w:t>
+      </w:r>
+      <w:proofErr w:type="spellStart"/>
+      <w:r>
+        <w:t>setelah</w:t>
+      </w:r>
+      <w:proofErr w:type="spellEnd"/>
+      <w:r>
+        <w:t xml:space="preserve"> </w:t>
+      </w:r>
+      <w:proofErr w:type="spellStart"/>
+      <w:r>
+        <w:t>ditemukan</w:t>
+      </w:r>
+      <w:proofErr w:type="spellEnd"/>
+      <w:r>
+        <w:t xml:space="preserve"> </w:t>
+      </w:r>
+      <w:proofErr w:type="spellStart"/>
+      <w:r>
+        <w:t>jalur</w:t>
+      </w:r>
+      <w:proofErr w:type="spellEnd"/>
+      <w:r>
+        <w:t xml:space="preserve"> </w:t>
+      </w:r>
+      <w:proofErr w:type="spellStart"/>
+      <w:r>
+        <w:t>menuju</w:t>
+      </w:r>
+      <w:proofErr w:type="spellEnd"/>
+      <w:r>
+        <w:t xml:space="preserve"> A </w:t>
+      </w:r>
+      <w:proofErr w:type="spellStart"/>
+      <w:r>
+        <w:t>dengan</w:t>
+      </w:r>
+      <w:proofErr w:type="spellEnd"/>
+      <w:r>
+        <w:t xml:space="preserve"> </w:t>
+      </w:r>
+      <w:proofErr w:type="spellStart"/>
+      <w:r>
+        <w:t>biaya</w:t>
+      </w:r>
+      <w:proofErr w:type="spellEnd"/>
+      <w:r>
+        <w:t xml:space="preserve"> </w:t>
+      </w:r>
+      <w:proofErr w:type="spellStart"/>
+      <w:r>
+        <w:t>lebih</w:t>
+      </w:r>
+      <w:proofErr w:type="spellEnd"/>
+      <w:r>
+        <w:t xml:space="preserve"> </w:t>
+      </w:r>
+      <w:proofErr w:type="spellStart"/>
+      <w:r>
+        <w:t>rendah</w:t>
+      </w:r>
+      <w:proofErr w:type="spellEnd"/>
+      <w:r>
+        <w:t>.</w:t>
+      </w:r>
+    </w:p>
+    <w:p>
+      <w:pPr>
+        <w:jc w:val="both"/>
+      </w:pPr>
+      <w:proofErr w:type="spellStart"/>
+      <w:r>
+        <w:t>Pemilihan</w:t>
+      </w:r>
+      <w:proofErr w:type="spellEnd"/>
+      <w:r>
+        <w:t xml:space="preserve"> tab, </w:t>
+      </w:r>
+      <w:proofErr w:type="spellStart"/>
+      <w:r>
+        <w:t>skenario</w:t>
+      </w:r>
+      <w:proofErr w:type="spellEnd"/>
+      <w:r>
+        <w:t xml:space="preserve">, </w:t>
+      </w:r>
+      <w:proofErr w:type="spellStart"/>
+      <w:r>
+        <w:t>nilai</w:t>
+      </w:r>
+      <w:proofErr w:type="spellEnd"/>
+      <w:r>
+        <w:t xml:space="preserve"> pada </w:t>
+      </w:r>
+      <w:proofErr w:type="spellStart"/>
+      <w:r>
+        <w:t>penggeser</w:t>
+      </w:r>
+      <w:proofErr w:type="spellEnd"/>
+      <w:r>
+        <w:t xml:space="preserve">, dan </w:t>
+      </w:r>
+      <w:proofErr w:type="spellStart"/>
+      <w:r>
+        <w:t>tombol</w:t>
+      </w:r>
+      <w:proofErr w:type="spellEnd"/>
+      <w:r>
+        <w:t xml:space="preserve"> </w:t>
+      </w:r>
+      <w:proofErr w:type="spellStart"/>
+      <w:r>
+        <w:t>animasi</w:t>
+      </w:r>
+      <w:proofErr w:type="spellEnd"/>
+      <w:r>
+        <w:t xml:space="preserve"> </w:t>
+      </w:r>
+      <w:proofErr w:type="spellStart"/>
+      <w:r>
+        <w:t>menggunakan</w:t>
+      </w:r>
+      <w:proofErr w:type="spellEnd"/>
+      <w:r>
+        <w:t xml:space="preserve"> </w:t>
+      </w:r>
+      <w:proofErr w:type="spellStart"/>
+      <w:r>
+        <w:t>hasil</w:t>
+      </w:r>
+      <w:proofErr w:type="spellEnd"/>
+      <w:r>
+        <w:t xml:space="preserve"> </w:t>
+      </w:r>
+      <w:proofErr w:type="spellStart"/>
+      <w:r>
+        <w:t>perhitungan</w:t>
+      </w:r>
+      <w:proofErr w:type="spellEnd"/>
+      <w:r>
+        <w:t xml:space="preserve"> yang </w:t>
+      </w:r>
+      <w:proofErr w:type="spellStart"/>
+      <w:r>
+        <w:t>sudah</w:t>
+      </w:r>
+      <w:proofErr w:type="spellEnd"/>
+      <w:r>
+        <w:t xml:space="preserve"> </w:t>
+      </w:r>
+      <w:proofErr w:type="spellStart"/>
+      <w:r>
+        <w:t>diterima</w:t>
+      </w:r>
+      <w:proofErr w:type="spellEnd"/>
+      <w:r>
+        <w:t xml:space="preserve"> </w:t>
+      </w:r>
+      <w:proofErr w:type="spellStart"/>
+      <w:r>
+        <w:t>dari</w:t>
+      </w:r>
+      <w:proofErr w:type="spellEnd"/>
+      <w:r>
+        <w:t xml:space="preserve"> Python. </w:t>
+      </w:r>
+      <w:proofErr w:type="spellStart"/>
+      <w:r>
+        <w:t>Untuk</w:t>
+      </w:r>
+      <w:proofErr w:type="spellEnd"/>
+      <w:r>
+        <w:t xml:space="preserve"> </w:t>
+      </w:r>
+      <w:proofErr w:type="spellStart"/>
+      <w:r>
+        <w:t>meminta</w:t>
+      </w:r>
+      <w:proofErr w:type="spellEnd"/>
+      <w:r>
+        <w:t xml:space="preserve"> </w:t>
+      </w:r>
+      <w:proofErr w:type="spellStart"/>
+      <w:r>
+        <w:t>perhitungan</w:t>
+      </w:r>
+      <w:proofErr w:type="spellEnd"/>
+      <w:r>
+        <w:t xml:space="preserve"> </w:t>
+      </w:r>
+      <w:proofErr w:type="spellStart"/>
+      <w:r>
+        <w:t>kembali</w:t>
+      </w:r>
+      <w:proofErr w:type="spellEnd"/>
+      <w:r>
+        <w:t xml:space="preserve">, </w:t>
+      </w:r>
+      <w:proofErr w:type="spellStart"/>
+      <w:r>
+        <w:t>pengguna</w:t>
+      </w:r>
+      <w:proofErr w:type="spellEnd"/>
+      <w:r>
+        <w:t xml:space="preserve"> </w:t>
+      </w:r>
+      <w:proofErr w:type="spellStart"/>
+      <w:r>
+        <w:t>perlu</w:t>
+      </w:r>
+      <w:proofErr w:type="spellEnd"/>
+      <w:r>
+        <w:t xml:space="preserve"> </w:t>
+      </w:r>
+      <w:proofErr w:type="spellStart"/>
+      <w:r>
+        <w:t>memuat</w:t>
+      </w:r>
+      <w:proofErr w:type="spellEnd"/>
+      <w:r>
+        <w:t xml:space="preserve"> </w:t>
+      </w:r>
+      <w:proofErr w:type="spellStart"/>
+      <w:r>
+        <w:t>ulang</w:t>
+      </w:r>
+      <w:proofErr w:type="spellEnd"/>
+      <w:r>
+        <w:t xml:space="preserve"> </w:t>
+      </w:r>
+      <w:proofErr w:type="spellStart"/>
+      <w:r>
+        <w:t>halaman</w:t>
+      </w:r>
+      <w:proofErr w:type="spellEnd"/>
+      <w:r>
+        <w:t xml:space="preserve">. Jika </w:t>
+      </w:r>
+      <w:proofErr w:type="spellStart"/>
+      <w:r>
+        <w:t>terdapat</w:t>
+      </w:r>
+      <w:proofErr w:type="spellEnd"/>
+      <w:r>
+        <w:t xml:space="preserve"> </w:t>
+      </w:r>
+      <w:proofErr w:type="spellStart"/>
+      <w:r>
+        <w:t>perubahan</w:t>
+      </w:r>
+      <w:proofErr w:type="spellEnd"/>
+      <w:r>
+        <w:t xml:space="preserve"> pada </w:t>
+      </w:r>
+      <w:proofErr w:type="spellStart"/>
+      <w:r>
+        <w:t>kode</w:t>
+      </w:r>
+      <w:proofErr w:type="spellEnd"/>
+      <w:r>
+        <w:t xml:space="preserve"> </w:t>
+      </w:r>
+      <w:proofErr w:type="spellStart"/>
+      <w:r>
+        <w:t>atau</w:t>
+      </w:r>
+      <w:proofErr w:type="spellEnd"/>
+      <w:r>
+        <w:t xml:space="preserve"> data Python, </w:t>
+      </w:r>
+      <w:proofErr w:type="spellStart"/>
+      <w:r>
+        <w:t>simpan</w:t>
+      </w:r>
+      <w:proofErr w:type="spellEnd"/>
+      <w:r>
+        <w:t xml:space="preserve"> </w:t>
+      </w:r>
+      <w:proofErr w:type="spellStart"/>
+      <w:r>
+        <w:t>perubahan</w:t>
+      </w:r>
+      <w:proofErr w:type="spellEnd"/>
+      <w:r>
+        <w:t xml:space="preserve">, </w:t>
+      </w:r>
+      <w:proofErr w:type="spellStart"/>
+      <w:r>
+        <w:t>hentikan</w:t>
+      </w:r>
+      <w:proofErr w:type="spellEnd"/>
+      <w:r>
+        <w:t xml:space="preserve"> server </w:t>
+      </w:r>
+      <w:proofErr w:type="spellStart"/>
+      <w:r>
+        <w:t>dengan</w:t>
+      </w:r>
+      <w:proofErr w:type="spellEnd"/>
+      <w:r>
+        <w:t xml:space="preserve"> </w:t>
+      </w:r>
+      <w:proofErr w:type="spellStart"/>
+      <w:r>
+        <w:t>Ctrl+C</w:t>
+      </w:r>
+      <w:proofErr w:type="spellEnd"/>
+      <w:r>
+        <w:t xml:space="preserve">, </w:t>
+      </w:r>
+      <w:proofErr w:type="spellStart"/>
+      <w:r>
+        <w:t>jalankan</w:t>
+      </w:r>
+      <w:proofErr w:type="spellEnd"/>
+      <w:r>
+        <w:t xml:space="preserve"> </w:t>
+      </w:r>
+      <w:proofErr w:type="spellStart"/>
+      <w:r>
+        <w:t>kembali</w:t>
+      </w:r>
+      <w:proofErr w:type="spellEnd"/>
+      <w:r>
+        <w:t xml:space="preserve"> server, </w:t>
+      </w:r>
+      <w:proofErr w:type="spellStart"/>
+      <w:r>
+        <w:t>lalu</w:t>
+      </w:r>
+      <w:proofErr w:type="spellEnd"/>
+      <w:r>
+        <w:t xml:space="preserve"> </w:t>
+      </w:r>
+      <w:proofErr w:type="spellStart"/>
+      <w:r>
+        <w:t>muat</w:t>
+      </w:r>
+      <w:proofErr w:type="spellEnd"/>
+      <w:r>
+        <w:t xml:space="preserve"> </w:t>
+      </w:r>
+      <w:proofErr w:type="spellStart"/>
+      <w:r>
+        <w:t>ulang</w:t>
+      </w:r>
+      <w:proofErr w:type="spellEnd"/>
+      <w:r>
+        <w:t xml:space="preserve"> </w:t>
+      </w:r>
+      <w:proofErr w:type="spellStart"/>
+      <w:r>
+        <w:t>halaman</w:t>
+      </w:r>
+      <w:proofErr w:type="spellEnd"/>
+      <w:r>
+        <w:t xml:space="preserve">. Teks </w:t>
+      </w:r>
+      <w:proofErr w:type="spellStart"/>
+      <w:r>
+        <w:t>penjelasan</w:t>
+      </w:r>
+      <w:proofErr w:type="spellEnd"/>
+      <w:r>
+        <w:t xml:space="preserve"> pada </w:t>
+      </w:r>
+      <w:proofErr w:type="spellStart"/>
+      <w:r>
+        <w:t>tampilan</w:t>
+      </w:r>
+      <w:proofErr w:type="spellEnd"/>
+      <w:r>
+        <w:t xml:space="preserve"> juga </w:t>
+      </w:r>
+      <w:proofErr w:type="spellStart"/>
+      <w:r>
+        <w:t>perlu</w:t>
+      </w:r>
+      <w:proofErr w:type="spellEnd"/>
+      <w:r>
+        <w:t xml:space="preserve"> </w:t>
+      </w:r>
+      <w:proofErr w:type="spellStart"/>
+      <w:r>
+        <w:t>diperiksa</w:t>
+      </w:r>
+      <w:proofErr w:type="spellEnd"/>
+      <w:r>
+        <w:t xml:space="preserve"> agar </w:t>
+      </w:r>
+      <w:proofErr w:type="spellStart"/>
+      <w:r>
+        <w:t>tetap</w:t>
+      </w:r>
+      <w:proofErr w:type="spellEnd"/>
+      <w:r>
+        <w:t xml:space="preserve"> </w:t>
+      </w:r>
+      <w:proofErr w:type="spellStart"/>
+      <w:r>
+        <w:t>sesuai</w:t>
+      </w:r>
+      <w:proofErr w:type="spellEnd"/>
+      <w:r>
+        <w:t xml:space="preserve"> </w:t>
+      </w:r>
+      <w:proofErr w:type="spellStart"/>
+      <w:r>
+        <w:t>dengan</w:t>
+      </w:r>
+      <w:proofErr w:type="spellEnd"/>
+      <w:r>
+        <w:t xml:space="preserve"> data yang </w:t>
+      </w:r>
+      <w:proofErr w:type="spellStart"/>
+      <w:r>
+        <w:t>telah</w:t>
+      </w:r>
+      <w:proofErr w:type="spellEnd"/>
+      <w:r>
+        <w:t xml:space="preserve"> </w:t>
+      </w:r>
+      <w:proofErr w:type="spellStart"/>
+      <w:r>
+        <w:t>diubah</w:t>
+      </w:r>
+      <w:proofErr w:type="spellEnd"/>
+      <w:r>
+        <w:t>.</w:t>
+      </w:r>
+    </w:p>
+    <w:p>
+      <w:pPr>
+        <w:jc w:val="both"/>
+      </w:pPr>
+      <w:proofErr w:type="spellStart"/>
+      <w:r>
+        <w:t>Seluruh</w:t>
+      </w:r>
+      <w:proofErr w:type="spellEnd"/>
+      <w:r>
+        <w:t xml:space="preserve"> data </w:t>
+      </w:r>
+      <w:proofErr w:type="spellStart"/>
+      <w:r>
+        <w:t>jalan</w:t>
+      </w:r>
+      <w:proofErr w:type="spellEnd"/>
+      <w:r>
+        <w:t xml:space="preserve"> </w:t>
+      </w:r>
+      <w:proofErr w:type="spellStart"/>
+      <w:r>
+        <w:t>dalam</w:t>
+      </w:r>
+      <w:proofErr w:type="spellEnd"/>
+      <w:r>
+        <w:t xml:space="preserve"> </w:t>
+      </w:r>
+      <w:proofErr w:type="spellStart"/>
+      <w:r>
+        <w:t>aplikasi</w:t>
+      </w:r>
+      <w:proofErr w:type="spellEnd"/>
+      <w:r>
+        <w:t xml:space="preserve"> </w:t>
+      </w:r>
+      <w:proofErr w:type="spellStart"/>
+      <w:r>
+        <w:t>merupakan</w:t>
+      </w:r>
+      <w:proofErr w:type="spellEnd"/>
+      <w:r>
+        <w:t xml:space="preserve"> </w:t>
+      </w:r>
+      <w:proofErr w:type="spellStart"/>
+      <w:r>
+        <w:t>contoh</w:t>
+      </w:r>
+      <w:proofErr w:type="spellEnd"/>
+      <w:r>
+        <w:t xml:space="preserve"> </w:t>
+      </w:r>
+      <w:proofErr w:type="spellStart"/>
+      <w:r>
+        <w:t>ilustratif</w:t>
+      </w:r>
+      <w:proofErr w:type="spellEnd"/>
+      <w:r>
+        <w:t xml:space="preserve">. </w:t>
+      </w:r>
+      <w:proofErr w:type="spellStart"/>
+      <w:r>
+        <w:t>Perbandingan</w:t>
+      </w:r>
+      <w:proofErr w:type="spellEnd"/>
+      <w:r>
+        <w:t xml:space="preserve"> </w:t>
+      </w:r>
+      <w:proofErr w:type="spellStart"/>
+      <w:r>
+        <w:t>algoritma</w:t>
+      </w:r>
+      <w:proofErr w:type="spellEnd"/>
+      <w:r>
+        <w:t xml:space="preserve"> </w:t>
+      </w:r>
+      <w:proofErr w:type="spellStart"/>
+      <w:r>
+        <w:t>difokuskan</w:t>
+      </w:r>
+      <w:proofErr w:type="spellEnd"/>
+      <w:r>
+        <w:t xml:space="preserve"> pada </w:t>
+      </w:r>
+      <w:proofErr w:type="spellStart"/>
+      <w:r>
+        <w:t>rute</w:t>
+      </w:r>
+      <w:proofErr w:type="spellEnd"/>
+      <w:r>
+        <w:t xml:space="preserve">, total </w:t>
+      </w:r>
+      <w:proofErr w:type="spellStart"/>
+      <w:r>
+        <w:t>biaya</w:t>
+      </w:r>
+      <w:proofErr w:type="spellEnd"/>
+      <w:r>
+        <w:t xml:space="preserve">, dan </w:t>
+      </w:r>
+      <w:proofErr w:type="spellStart"/>
+      <w:r>
+        <w:t>jumlah</w:t>
+      </w:r>
+      <w:proofErr w:type="spellEnd"/>
+      <w:r>
+        <w:t xml:space="preserve"> </w:t>
+      </w:r>
+      <w:proofErr w:type="spellStart"/>
+      <w:r>
+        <w:t>ekspansi</w:t>
+      </w:r>
+      <w:proofErr w:type="spellEnd"/>
+      <w:r>
+        <w:t xml:space="preserve">, </w:t>
+      </w:r>
+      <w:proofErr w:type="spellStart"/>
+      <w:r>
+        <w:t>tanpa</w:t>
+      </w:r>
+      <w:proofErr w:type="spellEnd"/>
+      <w:r>
+        <w:t xml:space="preserve"> </w:t>
+      </w:r>
+      <w:proofErr w:type="spellStart"/>
+      <w:r>
+        <w:t>pengukuran</w:t>
+      </w:r>
+      <w:proofErr w:type="spellEnd"/>
+      <w:r>
+        <w:t xml:space="preserve"> </w:t>
+      </w:r>
+      <w:proofErr w:type="spellStart"/>
+      <w:r>
+        <w:t>waktu</w:t>
+      </w:r>
+      <w:proofErr w:type="spellEnd"/>
+      <w:r>
+        <w:t xml:space="preserve"> </w:t>
+      </w:r>
+      <w:proofErr w:type="spellStart"/>
+      <w:r>
+        <w:t>eksekusi</w:t>
+      </w:r>
+      <w:proofErr w:type="spellEnd"/>
+      <w:r>
+        <w:t xml:space="preserve"> </w:t>
+      </w:r>
+      <w:proofErr w:type="spellStart"/>
+      <w:r>
+        <w:t>maupun</w:t>
+      </w:r>
+      <w:proofErr w:type="spellEnd"/>
+      <w:r>
+        <w:t xml:space="preserve"> </w:t>
+      </w:r>
+      <w:proofErr w:type="spellStart"/>
+      <w:r>
+        <w:t>penggunaan</w:t>
+      </w:r>
+      <w:proofErr w:type="spellEnd"/>
+      <w:r>
+        <w:t xml:space="preserve"> </w:t>
+      </w:r>
+      <w:proofErr w:type="spellStart"/>
+      <w:r>
+        <w:t>memori</w:t>
+      </w:r>
+      <w:proofErr w:type="spellEnd"/>
+      <w:r>
+        <w:t xml:space="preserve">. </w:t>
+      </w:r>
+      <w:proofErr w:type="spellStart"/>
+      <w:r>
+        <w:t>Sebelum</w:t>
+      </w:r>
+      <w:proofErr w:type="spellEnd"/>
+      <w:r>
+        <w:t xml:space="preserve"> </w:t>
+      </w:r>
+      <w:proofErr w:type="spellStart"/>
+      <w:r>
+        <w:t>melakukan</w:t>
+      </w:r>
+      <w:proofErr w:type="spellEnd"/>
+      <w:r>
+        <w:t xml:space="preserve"> </w:t>
+      </w:r>
+      <w:proofErr w:type="spellStart"/>
+      <w:r>
+        <w:t>percobaan</w:t>
+      </w:r>
+      <w:proofErr w:type="spellEnd"/>
+      <w:r>
+        <w:t xml:space="preserve"> </w:t>
+      </w:r>
+      <w:proofErr w:type="spellStart"/>
+      <w:r>
+        <w:t>dengan</w:t>
+      </w:r>
+      <w:proofErr w:type="spellEnd"/>
+      <w:r>
+        <w:t xml:space="preserve"> data lain, </w:t>
+      </w:r>
+      <w:proofErr w:type="spellStart"/>
+      <w:r>
+        <w:t>periksa</w:t>
+      </w:r>
+      <w:proofErr w:type="spellEnd"/>
+      <w:r>
+        <w:t xml:space="preserve"> </w:t>
+      </w:r>
+      <w:proofErr w:type="spellStart"/>
+      <w:r>
+        <w:t>kesesuaian</w:t>
+      </w:r>
+      <w:proofErr w:type="spellEnd"/>
+      <w:r>
+        <w:t xml:space="preserve"> </w:t>
+      </w:r>
+      <w:proofErr w:type="spellStart"/>
+      <w:r>
+        <w:t>nama</w:t>
+      </w:r>
+      <w:proofErr w:type="spellEnd"/>
+      <w:r>
+        <w:t xml:space="preserve"> </w:t>
+      </w:r>
+      <w:proofErr w:type="spellStart"/>
+      <w:r>
+        <w:t>simpul</w:t>
+      </w:r>
+      <w:proofErr w:type="spellEnd"/>
+      <w:r>
+        <w:t xml:space="preserve">, </w:t>
+      </w:r>
+      <w:proofErr w:type="spellStart"/>
+      <w:r>
+        <w:t>hubungan</w:t>
+      </w:r>
+      <w:proofErr w:type="spellEnd"/>
+      <w:r>
+        <w:t xml:space="preserve"> </w:t>
+      </w:r>
+      <w:proofErr w:type="spellStart"/>
+      <w:r>
+        <w:t>antarjalan</w:t>
+      </w:r>
+      <w:proofErr w:type="spellEnd"/>
+      <w:r>
+        <w:t xml:space="preserve">, </w:t>
+      </w:r>
+      <w:proofErr w:type="spellStart"/>
+      <w:r>
+        <w:t>bobot</w:t>
+      </w:r>
+      <w:proofErr w:type="spellEnd"/>
+      <w:r>
+        <w:t xml:space="preserve"> </w:t>
+      </w:r>
+      <w:proofErr w:type="spellStart"/>
+      <w:r>
+        <w:t>nonnegatif</w:t>
+      </w:r>
+      <w:proofErr w:type="spellEnd"/>
+      <w:r>
+        <w:t xml:space="preserve">, dan </w:t>
+      </w:r>
+      <w:proofErr w:type="spellStart"/>
+      <w:r>
+        <w:t>nilai</w:t>
+      </w:r>
+      <w:proofErr w:type="spellEnd"/>
+      <w:r>
+        <w:t xml:space="preserve"> </w:t>
+      </w:r>
+      <w:proofErr w:type="spellStart"/>
+      <w:r>
+        <w:t>heuristik</w:t>
+      </w:r>
+      <w:proofErr w:type="spellEnd"/>
+      <w:r>
+        <w:t xml:space="preserve"> agar </w:t>
+      </w:r>
+      <w:proofErr w:type="spellStart"/>
+      <w:r>
+        <w:t>hasilnya</w:t>
+      </w:r>
+      <w:proofErr w:type="spellEnd"/>
+      <w:r>
+        <w:t xml:space="preserve"> </w:t>
+      </w:r>
+      <w:proofErr w:type="spellStart"/>
+      <w:r>
+        <w:t>dapat</w:t>
+      </w:r>
+      <w:proofErr w:type="spellEnd"/>
+      <w:r>
+        <w:t xml:space="preserve"> </w:t>
+      </w:r>
+      <w:proofErr w:type="spellStart"/>
+      <w:r>
+        <w:t>ditafsirkan</w:t>
+      </w:r>
+      <w:proofErr w:type="spellEnd"/>
+      <w:r>
+        <w:t xml:space="preserve"> </w:t>
+      </w:r>
+      <w:proofErr w:type="spellStart"/>
+      <w:r>
+        <w:t>dengan</w:t>
+      </w:r>
+      <w:proofErr w:type="spellEnd"/>
+      <w:r>
+        <w:t xml:space="preserve"> </w:t>
+      </w:r>
+      <w:proofErr w:type="spellStart"/>
+      <w:r>
+        <w:t>tepat</w:t>
+      </w:r>
+      <w:proofErr w:type="spellEnd"/>
+      <w:r>
+        <w:t>.</w:t>
       </w:r>
     </w:p>
     <w:p>
@@ -13876,6 +17588,330 @@
         <w:pStyle w:val="Heading1"/>
       </w:pPr>
       <w:r>
+        <w:t xml:space="preserve">Lampiran C </w:t>
+      </w:r>
+      <w:proofErr w:type="spellStart"/>
+      <w:r>
+        <w:t>Penggunaan</w:t>
+      </w:r>
+      <w:proofErr w:type="spellEnd"/>
+      <w:r>
+        <w:t xml:space="preserve"> Alat Bantu </w:t>
+      </w:r>
+      <w:proofErr w:type="spellStart"/>
+      <w:r>
+        <w:t>Kecerdasan</w:t>
+      </w:r>
+      <w:proofErr w:type="spellEnd"/>
+      <w:r>
+        <w:t xml:space="preserve"> </w:t>
+      </w:r>
+      <w:proofErr w:type="spellStart"/>
+      <w:r>
+        <w:t>Buatan</w:t>
+      </w:r>
+      <w:proofErr w:type="spellEnd"/>
+      <w:r>
+        <w:t xml:space="preserve"> (AI)</w:t>
+      </w:r>
+    </w:p>
+    <w:p>
+      <w:pPr>
+        <w:jc w:val="both"/>
+      </w:pPr>
+      <w:proofErr w:type="spellStart"/>
+      <w:r>
+        <w:t>Dalam</w:t>
+      </w:r>
+      <w:proofErr w:type="spellEnd"/>
+      <w:r>
+        <w:t xml:space="preserve"> </w:t>
+      </w:r>
+      <w:proofErr w:type="spellStart"/>
+      <w:r>
+        <w:t>penyusunan</w:t>
+      </w:r>
+      <w:proofErr w:type="spellEnd"/>
+      <w:r>
+        <w:t xml:space="preserve"> </w:t>
+      </w:r>
+      <w:proofErr w:type="spellStart"/>
+      <w:r>
+        <w:t>laporan</w:t>
+      </w:r>
+      <w:proofErr w:type="spellEnd"/>
+      <w:r>
+        <w:t xml:space="preserve"> dan </w:t>
+      </w:r>
+      <w:proofErr w:type="spellStart"/>
+      <w:r>
+        <w:t>pengembangan</w:t>
+      </w:r>
+      <w:proofErr w:type="spellEnd"/>
+      <w:r>
+        <w:t xml:space="preserve"> program </w:t>
+      </w:r>
+      <w:proofErr w:type="spellStart"/>
+      <w:r>
+        <w:t>ini</w:t>
+      </w:r>
+      <w:proofErr w:type="spellEnd"/>
+      <w:r>
+        <w:t xml:space="preserve">, </w:t>
+      </w:r>
+      <w:proofErr w:type="spellStart"/>
+      <w:r>
+        <w:t>penulis</w:t>
+      </w:r>
+      <w:proofErr w:type="spellEnd"/>
+      <w:r>
+        <w:t xml:space="preserve"> </w:t>
+      </w:r>
+      <w:proofErr w:type="spellStart"/>
+      <w:r>
+        <w:t>menggunakan</w:t>
+      </w:r>
+      <w:proofErr w:type="spellEnd"/>
+      <w:r>
+        <w:t xml:space="preserve"> </w:t>
+      </w:r>
+      <w:proofErr w:type="spellStart"/>
+      <w:r>
+        <w:t>ChatGPT</w:t>
+      </w:r>
+      <w:proofErr w:type="spellEnd"/>
+      <w:r>
+        <w:t xml:space="preserve"> </w:t>
+      </w:r>
+      <w:proofErr w:type="spellStart"/>
+      <w:r>
+        <w:t>sebagai</w:t>
+      </w:r>
+      <w:proofErr w:type="spellEnd"/>
+      <w:r>
+        <w:t xml:space="preserve"> </w:t>
+      </w:r>
+      <w:proofErr w:type="spellStart"/>
+      <w:r>
+        <w:t>alat</w:t>
+      </w:r>
+      <w:proofErr w:type="spellEnd"/>
+      <w:r>
+        <w:t xml:space="preserve"> </w:t>
+      </w:r>
+      <w:proofErr w:type="spellStart"/>
+      <w:r>
+        <w:t>bantu</w:t>
+      </w:r>
+      <w:proofErr w:type="spellEnd"/>
+      <w:r>
+        <w:t xml:space="preserve"> </w:t>
+      </w:r>
+      <w:proofErr w:type="spellStart"/>
+      <w:r>
+        <w:t>untuk</w:t>
+      </w:r>
+      <w:proofErr w:type="spellEnd"/>
+      <w:r>
+        <w:t xml:space="preserve"> </w:t>
+      </w:r>
+      <w:proofErr w:type="spellStart"/>
+      <w:r>
+        <w:t>memahami</w:t>
+      </w:r>
+      <w:proofErr w:type="spellEnd"/>
+      <w:r>
+        <w:t xml:space="preserve"> </w:t>
+      </w:r>
+      <w:proofErr w:type="spellStart"/>
+      <w:r>
+        <w:t>algoritma</w:t>
+      </w:r>
+      <w:proofErr w:type="spellEnd"/>
+      <w:r>
+        <w:t xml:space="preserve"> A* Search dan </w:t>
+      </w:r>
+      <w:proofErr w:type="spellStart"/>
+      <w:r>
+        <w:t>menjelaskan</w:t>
+      </w:r>
+      <w:proofErr w:type="spellEnd"/>
+      <w:r>
+        <w:t xml:space="preserve"> </w:t>
+      </w:r>
+      <w:proofErr w:type="spellStart"/>
+      <w:r>
+        <w:t>kode</w:t>
+      </w:r>
+      <w:proofErr w:type="spellEnd"/>
+      <w:r>
+        <w:t xml:space="preserve"> Python, </w:t>
+      </w:r>
+      <w:proofErr w:type="spellStart"/>
+      <w:r>
+        <w:t>mengembangkan</w:t>
+      </w:r>
+      <w:proofErr w:type="spellEnd"/>
+      <w:r>
+        <w:t xml:space="preserve"> </w:t>
+      </w:r>
+      <w:proofErr w:type="spellStart"/>
+      <w:r>
+        <w:t>visualisasi</w:t>
+      </w:r>
+      <w:proofErr w:type="spellEnd"/>
+      <w:r>
+        <w:t xml:space="preserve"> web, </w:t>
+      </w:r>
+      <w:proofErr w:type="spellStart"/>
+      <w:r>
+        <w:t>serta</w:t>
+      </w:r>
+      <w:proofErr w:type="spellEnd"/>
+      <w:r>
+        <w:t xml:space="preserve"> </w:t>
+      </w:r>
+      <w:proofErr w:type="spellStart"/>
+      <w:r>
+        <w:t>merancang</w:t>
+      </w:r>
+      <w:proofErr w:type="spellEnd"/>
+      <w:r>
+        <w:t xml:space="preserve"> </w:t>
+      </w:r>
+      <w:proofErr w:type="spellStart"/>
+      <w:r>
+        <w:t>pengujian</w:t>
+      </w:r>
+      <w:proofErr w:type="spellEnd"/>
+      <w:r>
+        <w:t xml:space="preserve"> dan </w:t>
+      </w:r>
+      <w:proofErr w:type="spellStart"/>
+      <w:r>
+        <w:t>perbandingan</w:t>
+      </w:r>
+      <w:proofErr w:type="spellEnd"/>
+      <w:r>
+        <w:t xml:space="preserve"> </w:t>
+      </w:r>
+      <w:proofErr w:type="spellStart"/>
+      <w:r>
+        <w:t>algoritma</w:t>
+      </w:r>
+      <w:proofErr w:type="spellEnd"/>
+      <w:r>
+        <w:t xml:space="preserve">. </w:t>
+      </w:r>
+      <w:proofErr w:type="spellStart"/>
+      <w:r>
+        <w:t>ChatGPT</w:t>
+      </w:r>
+      <w:proofErr w:type="spellEnd"/>
+      <w:r>
+        <w:t xml:space="preserve"> juga </w:t>
+      </w:r>
+      <w:proofErr w:type="spellStart"/>
+      <w:r>
+        <w:t>digunakan</w:t>
+      </w:r>
+      <w:proofErr w:type="spellEnd"/>
+      <w:r>
+        <w:t xml:space="preserve"> </w:t>
+      </w:r>
+      <w:proofErr w:type="spellStart"/>
+      <w:r>
+        <w:t>untuk</w:t>
+      </w:r>
+      <w:proofErr w:type="spellEnd"/>
+      <w:r>
+        <w:t xml:space="preserve"> </w:t>
+      </w:r>
+      <w:proofErr w:type="spellStart"/>
+      <w:r>
+        <w:t>membantu</w:t>
+      </w:r>
+      <w:proofErr w:type="spellEnd"/>
+      <w:r>
+        <w:t xml:space="preserve"> </w:t>
+      </w:r>
+      <w:proofErr w:type="spellStart"/>
+      <w:r>
+        <w:t>memperbaiki</w:t>
+      </w:r>
+      <w:proofErr w:type="spellEnd"/>
+      <w:r>
+        <w:t xml:space="preserve"> </w:t>
+      </w:r>
+      <w:proofErr w:type="spellStart"/>
+      <w:r>
+        <w:t>kalimat</w:t>
+      </w:r>
+      <w:proofErr w:type="spellEnd"/>
+      <w:r>
+        <w:t xml:space="preserve"> dan </w:t>
+      </w:r>
+      <w:proofErr w:type="spellStart"/>
+      <w:r>
+        <w:t>melakukan</w:t>
+      </w:r>
+      <w:proofErr w:type="spellEnd"/>
+      <w:r>
+        <w:t xml:space="preserve"> </w:t>
+      </w:r>
+      <w:proofErr w:type="spellStart"/>
+      <w:r>
+        <w:t>parafrase</w:t>
+      </w:r>
+      <w:proofErr w:type="spellEnd"/>
+      <w:r>
+        <w:t xml:space="preserve"> agar </w:t>
+      </w:r>
+      <w:proofErr w:type="spellStart"/>
+      <w:r>
+        <w:t>pembahasan</w:t>
+      </w:r>
+      <w:proofErr w:type="spellEnd"/>
+      <w:r>
+        <w:t xml:space="preserve"> </w:t>
+      </w:r>
+      <w:proofErr w:type="spellStart"/>
+      <w:r>
+        <w:t>lebih</w:t>
+      </w:r>
+      <w:proofErr w:type="spellEnd"/>
+      <w:r>
+        <w:t xml:space="preserve"> </w:t>
+      </w:r>
+      <w:proofErr w:type="spellStart"/>
+      <w:r>
+        <w:t>mudah</w:t>
+      </w:r>
+      <w:proofErr w:type="spellEnd"/>
+      <w:r>
+        <w:t xml:space="preserve"> </w:t>
+      </w:r>
+      <w:proofErr w:type="spellStart"/>
+      <w:r>
+        <w:t>dipahami</w:t>
+      </w:r>
+      <w:proofErr w:type="spellEnd"/>
+      <w:r>
+        <w:t>.</w:t>
+      </w:r>
+    </w:p>
+    <w:p>
+      <w:pPr>
+        <w:ind w:firstLine="0"/>
+        <w:jc w:val="both"/>
+      </w:pPr>
+    </w:p>
+    <w:p>
+      <w:pPr>
+        <w:pStyle w:val="Heading1"/>
+      </w:pPr>
+      <w:r>
+        <w:lastRenderedPageBreak/>
         <w:t>Daftar Pustaka</w:t>
       </w:r>
     </w:p>

</xml_diff>